<commit_message>
Send each environment's service number as the originating system
triggerOriginatingSystem was the SIT service number for every
environment and idSystem the literal "Corelation id". Both are now the
service number of the environment the task runs in, from
envelope.originating_systems keyed by app.environment
(IFC_APP__ENVIRONMENT on the task, any case):

  DEV            SNSVC0084379
  SIT            SNSVC0084378
  PROD-ANALYTICS SNSVC0084375
  PROD-PARALLEL  SNSVC0084371
  PROD           SNSVC0084373

The same code starts every trigger ID and is part of the business key.
The runner resolves it before any network call; an environment not in
the map stops the run rather than publish under another environment's
number. A startup line logs the code in use.

The preflight DNS/TCP connect timeout is 30s, in the config and the code
default. The briefing in info/ is regenerated to match.

Co-Authored-By: Claude Opus 5.5 <noreply@anthropic.com>
</commit_message>
<xml_diff>
--- a/info/TRIGGER_9 Kafka Metadata Failure.docx
+++ b/info/TRIGGER_9 Kafka Metadata Failure.docx
@@ -13,7 +13,7 @@
           <w:sz w:val="16"/>
           <w:spacing w:val="20"/>
         </w:rPr>
-        <w:t>IFC TRIGGER CONNECTOR  ·  SIT  ·  TRIGGER_9  ·  6 OCTOBER 2026</w:t>
+        <w:t>IFC TRIGGER CONNECTOR · SIT · TRIGGER_9 · 6–7 OCTOBER 2026</w:t>
       </w:r>
     </w:p>
     <w:p>
@@ -21,7 +21,7 @@
         <w:pStyle w:val="Title"/>
       </w:pPr>
       <w:r>
-        <w:t>Where the Kafka publish is failing</w:t>
+        <w:t>Why the Kafka publish failed, and the fix</w:t>
       </w:r>
     </w:p>
     <w:p>
@@ -34,7 +34,7 @@
           <w:color w:val="18202B"/>
           <w:sz w:val="22"/>
         </w:rPr>
-        <w:t>Every check before the connection to the Kafka brokers passes. The run stops at the first request the producer sends to the brokers: the topic metadata lookup. No records have been read or published, because the connector stops before it reads the trigger table.</w:t>
+        <w:t>On 6 October every SIT run stopped at the first request to the Kafka brokers, a topic metadata lookup, and published nothing. The cause was in the connector. On the confluent-kafka 2.4 client in the image, the BSP callback that gives the brokers their BAM token runs only when the producer is polled, and the metadata lookup ran before any poll. The fix polls for the token first and leaves the broker connection to the first publish, as the Trigger Backbone's produce_app does. The run on 7 October published to the topic.</w:t>
       </w:r>
     </w:p>
     <w:tbl>
@@ -55,6 +55,47 @@
         <w:gridCol w:w="4819"/>
         <w:gridCol w:w="4819"/>
       </w:tblGrid>
+      <w:tr>
+        <w:tc>
+          <w:tcPr>
+            <w:tcW w:type="dxa" w:w="2551"/>
+            <w:shd w:val="clear" w:color="auto" w:fill="EEF0F3"/>
+          </w:tcPr>
+          <w:p>
+            <w:pPr>
+              <w:spacing w:before="40" w:after="40"/>
+            </w:pPr>
+            <w:r/>
+            <w:r>
+              <w:rPr>
+                <w:b/>
+                <w:color w:val="5A6575"/>
+                <w:sz w:val="16"/>
+              </w:rPr>
+              <w:t>STATUS</w:t>
+            </w:r>
+          </w:p>
+        </w:tc>
+        <w:tc>
+          <w:tcPr>
+            <w:tcW w:type="dxa" w:w="7087"/>
+          </w:tcPr>
+          <w:p>
+            <w:pPr>
+              <w:spacing w:before="40" w:after="40"/>
+            </w:pPr>
+            <w:r/>
+            <w:r>
+              <w:rPr>
+                <w:rFonts w:ascii="Consolas" w:hAnsi="Consolas"/>
+                <w:color w:val="1D7A4A"/>
+                <w:sz w:val="18"/>
+              </w:rPr>
+              <w:t>Resolved, 7 October 2026</w:t>
+            </w:r>
+          </w:p>
+        </w:tc>
+      </w:tr>
       <w:tr>
         <w:tc>
           <w:tcPr>
@@ -113,7 +154,7 @@
                 <w:color w:val="5A6575"/>
                 <w:sz w:val="16"/>
               </w:rPr>
-              <w:t>FAILED CHECK</w:t>
+              <w:t>FAILURE ON 6 OCTOBER</w:t>
             </w:r>
           </w:p>
         </w:tc>
@@ -129,10 +170,10 @@
             <w:r>
               <w:rPr>
                 <w:rFonts w:ascii="Consolas" w:hAnsi="Consolas"/>
-                <w:color w:val="18202B"/>
+                <w:color w:val="B42318"/>
                 <w:sz w:val="18"/>
               </w:rPr>
-              <w:t>kafka:metadata</w:t>
+              <w:t>kafka:metadata · _TRANSPORT · BROKER_UNAVAILABLE · exit 32</w:t>
             </w:r>
           </w:p>
         </w:tc>
@@ -154,7 +195,7 @@
                 <w:color w:val="5A6575"/>
                 <w:sz w:val="16"/>
               </w:rPr>
-              <w:t>CLASSIFICATION</w:t>
+              <w:t>ROOT CAUSE</w:t>
             </w:r>
           </w:p>
         </w:tc>
@@ -170,10 +211,10 @@
             <w:r>
               <w:rPr>
                 <w:rFonts w:ascii="Consolas" w:hAnsi="Consolas"/>
-                <w:color w:val="B42318"/>
+                <w:color w:val="18202B"/>
                 <w:sz w:val="18"/>
               </w:rPr>
-              <w:t>BROKER_UNAVAILABLE</w:t>
+              <w:t>BAM token not handed to librdkafka before the first broker request</w:t>
             </w:r>
           </w:p>
         </w:tc>
@@ -195,48 +236,7 @@
                 <w:color w:val="5A6575"/>
                 <w:sz w:val="16"/>
               </w:rPr>
-              <w:t>EXIT CODE</w:t>
-            </w:r>
-          </w:p>
-        </w:tc>
-        <w:tc>
-          <w:tcPr>
-            <w:tcW w:type="dxa" w:w="7087"/>
-          </w:tcPr>
-          <w:p>
-            <w:pPr>
-              <w:spacing w:before="40" w:after="40"/>
-            </w:pPr>
-            <w:r/>
-            <w:r>
-              <w:rPr>
-                <w:rFonts w:ascii="Consolas" w:hAnsi="Consolas"/>
-                <w:color w:val="B42318"/>
-                <w:sz w:val="18"/>
-              </w:rPr>
-              <w:t>32</w:t>
-            </w:r>
-          </w:p>
-        </w:tc>
-      </w:tr>
-      <w:tr>
-        <w:tc>
-          <w:tcPr>
-            <w:tcW w:type="dxa" w:w="2551"/>
-            <w:shd w:val="clear" w:color="auto" w:fill="EEF0F3"/>
-          </w:tcPr>
-          <w:p>
-            <w:pPr>
-              <w:spacing w:before="40" w:after="40"/>
-            </w:pPr>
-            <w:r/>
-            <w:r>
-              <w:rPr>
-                <w:b/>
-                <w:color w:val="5A6575"/>
-                <w:sz w:val="16"/>
-              </w:rPr>
-              <w:t>RECORDS PUBLISHED</w:t>
+              <w:t>FIX</w:t>
             </w:r>
           </w:p>
         </w:tc>
@@ -255,7 +255,7 @@
                 <w:color w:val="18202B"/>
                 <w:sz w:val="18"/>
               </w:rPr>
-              <w:t>0</w:t>
+              <w:t>485e874 (wait for the token) · 7b77eeb (metadata check off)</w:t>
             </w:r>
           </w:p>
         </w:tc>
@@ -313,7 +313,7 @@
           <w:sz w:val="16"/>
           <w:spacing w:val="20"/>
         </w:rPr>
-        <w:t>ERROR</w:t>
+        <w:t>ERROR IN THE FAILING RUNS</w:t>
       </w:r>
     </w:p>
     <w:p>
@@ -347,7 +347,7 @@
           <w:rFonts w:ascii="Consolas" w:hAnsi="Consolas"/>
           <w:sz w:val="17"/>
         </w:rPr>
-        <w:t>after ~10 000 ms (the preflight timeout at the time)</w:t>
+        <w:t>after 60 000 ms in the last failing run (20261006T173107Z)</w:t>
       </w:r>
     </w:p>
     <w:p>
@@ -368,7 +368,7 @@
           <w:color w:val="18202B"/>
           <w:sz w:val="21"/>
         </w:rPr>
-        <w:t xml:space="preserve">The steps run in this order on every invocation. Each step must pass before the next one starts. Under each step is what it sends and to which system, written as the equivalent command you could run by hand, with the configuration or environment variable each value comes from. Secrets are shown as </w:t>
+        <w:t xml:space="preserve">The steps run in this order on every invocation, as the code is now. Each must pass before the next starts. Under each step is what it sends and to which system, written as the equivalent command you could run by hand, with the configuration or environment variable each value comes from. Secrets are shown as </w:t>
       </w:r>
       <w:r>
         <w:rPr>
@@ -416,7 +416,7 @@
           <w:color w:val="18202B"/>
           <w:sz w:val="21"/>
         </w:rPr>
-        <w:t>.</w:t>
+        <w:t>, as of 7 October 2026.</w:t>
       </w:r>
     </w:p>
     <w:p>
@@ -449,7 +449,7 @@
           <w:color w:val="18202B"/>
           <w:sz w:val="21"/>
         </w:rPr>
-        <w:t>Decides whether this month should run (a forced run of 2026-09 here) and stops a month that is already delivered from being sent twice.</w:t>
+        <w:t>Decides whether this month should run and stops a month that is already delivered from being sent twice.</w:t>
       </w:r>
     </w:p>
     <w:p>
@@ -488,10 +488,10 @@
     </w:p>
     <w:p>
       <w:pPr>
+        <w:keepNext/>
         <w:spacing w:before="0" w:after="0" w:line="240" w:lineRule="auto"/>
         <w:ind w:left="113"/>
         <w:shd w:val="clear" w:color="auto" w:fill="EEF1F5"/>
-        <w:keepNext/>
         <w:pBdr>
           <w:top w:val="single" w:sz="4" w:space="3" w:color="DDE2E9"/>
         </w:pBdr>
@@ -507,9 +507,9 @@
     </w:p>
     <w:p>
       <w:pPr>
+        <w:keepNext/>
         <w:spacing w:before="0" w:after="0" w:line="240" w:lineRule="auto"/>
         <w:ind w:left="113"/>
-        <w:keepNext/>
         <w:shd w:val="clear" w:color="auto" w:fill="EEF1F5"/>
       </w:pPr>
       <w:r>
@@ -523,9 +523,9 @@
     </w:p>
     <w:p>
       <w:pPr>
+        <w:keepNext/>
         <w:spacing w:before="0" w:after="0" w:line="240" w:lineRule="auto"/>
         <w:ind w:left="113"/>
-        <w:keepNext/>
         <w:shd w:val="clear" w:color="auto" w:fill="EEF1F5"/>
       </w:pPr>
       <w:r>
@@ -539,10 +539,10 @@
     </w:p>
     <w:p>
       <w:pPr>
+        <w:keepNext w:val="0"/>
         <w:spacing w:before="0" w:after="0" w:line="240" w:lineRule="auto"/>
         <w:ind w:left="113"/>
         <w:shd w:val="clear" w:color="auto" w:fill="EEF1F5"/>
-        <w:keepNext w:val="0"/>
         <w:pBdr>
           <w:bottom w:val="single" w:sz="4" w:space="3" w:color="DDE2E9"/>
         </w:pBdr>
@@ -575,7 +575,7 @@
           <w:color w:val="18202B"/>
           <w:sz w:val="19"/>
         </w:rPr>
-        <w:t>The ECS task role. The forced month comes from the task's run-month and force variables.</w:t>
+        <w:t>The ECS task role. A forced month comes from the task's run-month and force variables.</w:t>
       </w:r>
     </w:p>
     <w:p>
@@ -690,10 +690,10 @@
     </w:p>
     <w:p>
       <w:pPr>
+        <w:keepNext/>
         <w:spacing w:before="0" w:after="0" w:line="240" w:lineRule="auto"/>
         <w:ind w:left="113"/>
         <w:shd w:val="clear" w:color="auto" w:fill="EEF1F5"/>
-        <w:keepNext/>
         <w:pBdr>
           <w:top w:val="single" w:sz="4" w:space="3" w:color="DDE2E9"/>
         </w:pBdr>
@@ -709,9 +709,9 @@
     </w:p>
     <w:p>
       <w:pPr>
+        <w:keepNext/>
         <w:spacing w:before="0" w:after="0" w:line="240" w:lineRule="auto"/>
         <w:ind w:left="113"/>
-        <w:keepNext/>
         <w:shd w:val="clear" w:color="auto" w:fill="EEF1F5"/>
       </w:pPr>
       <w:r>
@@ -725,9 +725,9 @@
     </w:p>
     <w:p>
       <w:pPr>
+        <w:keepNext/>
         <w:spacing w:before="0" w:after="0" w:line="240" w:lineRule="auto"/>
         <w:ind w:left="113"/>
-        <w:keepNext/>
         <w:shd w:val="clear" w:color="auto" w:fill="EEF1F5"/>
       </w:pPr>
       <w:r>
@@ -741,9 +741,9 @@
     </w:p>
     <w:p>
       <w:pPr>
+        <w:keepNext/>
         <w:spacing w:before="0" w:after="0" w:line="240" w:lineRule="auto"/>
         <w:ind w:left="113"/>
-        <w:keepNext/>
         <w:shd w:val="clear" w:color="auto" w:fill="EEF1F5"/>
       </w:pPr>
       <w:r>
@@ -757,9 +757,9 @@
     </w:p>
     <w:p>
       <w:pPr>
+        <w:keepNext/>
         <w:spacing w:before="0" w:after="0" w:line="240" w:lineRule="auto"/>
         <w:ind w:left="113"/>
-        <w:keepNext/>
         <w:shd w:val="clear" w:color="auto" w:fill="EEF1F5"/>
       </w:pPr>
       <w:r>
@@ -773,9 +773,9 @@
     </w:p>
     <w:p>
       <w:pPr>
+        <w:keepNext/>
         <w:spacing w:before="0" w:after="0" w:line="240" w:lineRule="auto"/>
         <w:ind w:left="113"/>
-        <w:keepNext/>
         <w:shd w:val="clear" w:color="auto" w:fill="EEF1F5"/>
       </w:pPr>
       <w:r>
@@ -789,9 +789,9 @@
     </w:p>
     <w:p>
       <w:pPr>
+        <w:keepNext/>
         <w:spacing w:before="0" w:after="0" w:line="240" w:lineRule="auto"/>
         <w:ind w:left="113"/>
-        <w:keepNext/>
         <w:shd w:val="clear" w:color="auto" w:fill="EEF1F5"/>
       </w:pPr>
       <w:r>
@@ -805,9 +805,9 @@
     </w:p>
     <w:p>
       <w:pPr>
+        <w:keepNext/>
         <w:spacing w:before="0" w:after="0" w:line="240" w:lineRule="auto"/>
         <w:ind w:left="113"/>
-        <w:keepNext/>
         <w:shd w:val="clear" w:color="auto" w:fill="EEF1F5"/>
       </w:pPr>
       <w:r>
@@ -821,10 +821,10 @@
     </w:p>
     <w:p>
       <w:pPr>
+        <w:keepNext w:val="0"/>
         <w:spacing w:before="0" w:after="0" w:line="240" w:lineRule="auto"/>
         <w:ind w:left="113"/>
         <w:shd w:val="clear" w:color="auto" w:fill="EEF1F5"/>
-        <w:keepNext w:val="0"/>
         <w:pBdr>
           <w:bottom w:val="single" w:sz="4" w:space="3" w:color="DDE2E9"/>
         </w:pBdr>
@@ -994,7 +994,7 @@
           <w:color w:val="5A6575"/>
           <w:sz w:val="16"/>
         </w:rPr>
-        <w:t>utility/connector_runner.py:173 → utility/trigger_source.py:123 · check_access</w:t>
+        <w:t>utility/connector_runner.py:176 → utility/trigger_source.py:123 · check_access</w:t>
       </w:r>
     </w:p>
     <w:p>
@@ -1020,10 +1020,10 @@
     </w:p>
     <w:p>
       <w:pPr>
+        <w:keepNext/>
         <w:spacing w:before="0" w:after="0" w:line="240" w:lineRule="auto"/>
         <w:ind w:left="113"/>
         <w:shd w:val="clear" w:color="auto" w:fill="EEF1F5"/>
-        <w:keepNext/>
         <w:pBdr>
           <w:top w:val="single" w:sz="4" w:space="3" w:color="DDE2E9"/>
         </w:pBdr>
@@ -1039,9 +1039,9 @@
     </w:p>
     <w:p>
       <w:pPr>
+        <w:keepNext/>
         <w:spacing w:before="0" w:after="0" w:line="240" w:lineRule="auto"/>
         <w:ind w:left="113"/>
-        <w:keepNext/>
         <w:shd w:val="clear" w:color="auto" w:fill="EEF1F5"/>
       </w:pPr>
       <w:r>
@@ -1055,9 +1055,9 @@
     </w:p>
     <w:p>
       <w:pPr>
+        <w:keepNext/>
         <w:spacing w:before="0" w:after="0" w:line="240" w:lineRule="auto"/>
         <w:ind w:left="113"/>
-        <w:keepNext/>
         <w:shd w:val="clear" w:color="auto" w:fill="EEF1F5"/>
       </w:pPr>
       <w:r>
@@ -1071,9 +1071,9 @@
     </w:p>
     <w:p>
       <w:pPr>
+        <w:keepNext/>
         <w:spacing w:before="0" w:after="0" w:line="240" w:lineRule="auto"/>
         <w:ind w:left="113"/>
-        <w:keepNext/>
         <w:shd w:val="clear" w:color="auto" w:fill="EEF1F5"/>
       </w:pPr>
       <w:r>
@@ -1087,10 +1087,10 @@
     </w:p>
     <w:p>
       <w:pPr>
+        <w:keepNext w:val="0"/>
         <w:spacing w:before="0" w:after="0" w:line="240" w:lineRule="auto"/>
         <w:ind w:left="113"/>
         <w:shd w:val="clear" w:color="auto" w:fill="EEF1F5"/>
-        <w:keepNext w:val="0"/>
         <w:pBdr>
           <w:bottom w:val="single" w:sz="4" w:space="3" w:color="DDE2E9"/>
         </w:pBdr>
@@ -1190,7 +1190,7 @@
           <w:color w:val="5A6575"/>
           <w:sz w:val="16"/>
         </w:rPr>
-        <w:t>utility/kafka_factory.py:516 → utility/ca_certificate.py · install</w:t>
+        <w:t>utility/kafka_factory.py:553 → utility/ca_certificate.py · install</w:t>
       </w:r>
     </w:p>
     <w:p>
@@ -1216,10 +1216,10 @@
     </w:p>
     <w:p>
       <w:pPr>
+        <w:keepNext/>
         <w:spacing w:before="0" w:after="0" w:line="240" w:lineRule="auto"/>
         <w:ind w:left="113"/>
         <w:shd w:val="clear" w:color="auto" w:fill="EEF1F5"/>
-        <w:keepNext/>
         <w:pBdr>
           <w:top w:val="single" w:sz="4" w:space="3" w:color="DDE2E9"/>
         </w:pBdr>
@@ -1235,9 +1235,9 @@
     </w:p>
     <w:p>
       <w:pPr>
+        <w:keepNext/>
         <w:spacing w:before="0" w:after="0" w:line="240" w:lineRule="auto"/>
         <w:ind w:left="113"/>
-        <w:keepNext/>
         <w:shd w:val="clear" w:color="auto" w:fill="EEF1F5"/>
       </w:pPr>
       <w:r>
@@ -1251,9 +1251,9 @@
     </w:p>
     <w:p>
       <w:pPr>
+        <w:keepNext/>
         <w:spacing w:before="0" w:after="0" w:line="240" w:lineRule="auto"/>
         <w:ind w:left="113"/>
-        <w:keepNext/>
         <w:shd w:val="clear" w:color="auto" w:fill="EEF1F5"/>
       </w:pPr>
       <w:r>
@@ -1267,9 +1267,9 @@
     </w:p>
     <w:p>
       <w:pPr>
+        <w:keepNext/>
         <w:spacing w:before="0" w:after="0" w:line="240" w:lineRule="auto"/>
         <w:ind w:left="113"/>
-        <w:keepNext/>
         <w:shd w:val="clear" w:color="auto" w:fill="EEF1F5"/>
       </w:pPr>
       <w:r>
@@ -1283,10 +1283,10 @@
     </w:p>
     <w:p>
       <w:pPr>
+        <w:keepNext w:val="0"/>
         <w:spacing w:before="0" w:after="0" w:line="240" w:lineRule="auto"/>
         <w:ind w:left="113"/>
         <w:shd w:val="clear" w:color="auto" w:fill="EEF1F5"/>
-        <w:keepNext w:val="0"/>
         <w:pBdr>
           <w:bottom w:val="single" w:sz="4" w:space="3" w:color="DDE2E9"/>
         </w:pBdr>
@@ -1418,7 +1418,7 @@
           <w:color w:val="5A6575"/>
           <w:sz w:val="16"/>
         </w:rPr>
-        <w:t>utility/kafka_factory.py:254 → utility/cyberark_ccp_fetch.py</w:t>
+        <w:t>utility/kafka_factory.py:260 → utility/cyberark_ccp_fetch.py</w:t>
       </w:r>
     </w:p>
     <w:p>
@@ -1444,10 +1444,10 @@
     </w:p>
     <w:p>
       <w:pPr>
+        <w:keepNext/>
         <w:spacing w:before="0" w:after="0" w:line="240" w:lineRule="auto"/>
         <w:ind w:left="113"/>
         <w:shd w:val="clear" w:color="auto" w:fill="EEF1F5"/>
-        <w:keepNext/>
         <w:pBdr>
           <w:top w:val="single" w:sz="4" w:space="3" w:color="DDE2E9"/>
         </w:pBdr>
@@ -1463,9 +1463,9 @@
     </w:p>
     <w:p>
       <w:pPr>
+        <w:keepNext/>
         <w:spacing w:before="0" w:after="0" w:line="240" w:lineRule="auto"/>
         <w:ind w:left="113"/>
-        <w:keepNext/>
         <w:shd w:val="clear" w:color="auto" w:fill="EEF1F5"/>
       </w:pPr>
       <w:r>
@@ -1479,10 +1479,10 @@
     </w:p>
     <w:p>
       <w:pPr>
+        <w:keepNext w:val="0"/>
         <w:spacing w:before="0" w:after="0" w:line="240" w:lineRule="auto"/>
         <w:ind w:left="113"/>
         <w:shd w:val="clear" w:color="auto" w:fill="EEF1F5"/>
-        <w:keepNext w:val="0"/>
         <w:pBdr>
           <w:bottom w:val="single" w:sz="4" w:space="3" w:color="DDE2E9"/>
         </w:pBdr>
@@ -1519,10 +1519,10 @@
     </w:p>
     <w:p>
       <w:pPr>
+        <w:keepNext/>
         <w:spacing w:before="0" w:after="0" w:line="240" w:lineRule="auto"/>
         <w:ind w:left="113"/>
         <w:shd w:val="clear" w:color="auto" w:fill="EEF1F5"/>
-        <w:keepNext/>
         <w:pBdr>
           <w:top w:val="single" w:sz="4" w:space="3" w:color="DDE2E9"/>
         </w:pBdr>
@@ -1538,9 +1538,9 @@
     </w:p>
     <w:p>
       <w:pPr>
+        <w:keepNext/>
         <w:spacing w:before="0" w:after="0" w:line="240" w:lineRule="auto"/>
         <w:ind w:left="113"/>
-        <w:keepNext/>
         <w:shd w:val="clear" w:color="auto" w:fill="EEF1F5"/>
       </w:pPr>
       <w:r>
@@ -1554,9 +1554,9 @@
     </w:p>
     <w:p>
       <w:pPr>
+        <w:keepNext/>
         <w:spacing w:before="0" w:after="0" w:line="240" w:lineRule="auto"/>
         <w:ind w:left="113"/>
-        <w:keepNext/>
         <w:shd w:val="clear" w:color="auto" w:fill="EEF1F5"/>
       </w:pPr>
       <w:r>
@@ -1570,9 +1570,9 @@
     </w:p>
     <w:p>
       <w:pPr>
+        <w:keepNext/>
         <w:spacing w:before="0" w:after="0" w:line="240" w:lineRule="auto"/>
         <w:ind w:left="113"/>
-        <w:keepNext/>
         <w:shd w:val="clear" w:color="auto" w:fill="EEF1F5"/>
       </w:pPr>
       <w:r>
@@ -1586,9 +1586,9 @@
     </w:p>
     <w:p>
       <w:pPr>
+        <w:keepNext/>
         <w:spacing w:before="0" w:after="0" w:line="240" w:lineRule="auto"/>
         <w:ind w:left="113"/>
-        <w:keepNext/>
         <w:shd w:val="clear" w:color="auto" w:fill="EEF1F5"/>
       </w:pPr>
       <w:r>
@@ -1602,9 +1602,9 @@
     </w:p>
     <w:p>
       <w:pPr>
+        <w:keepNext/>
         <w:spacing w:before="0" w:after="0" w:line="240" w:lineRule="auto"/>
         <w:ind w:left="113"/>
-        <w:keepNext/>
         <w:shd w:val="clear" w:color="auto" w:fill="EEF1F5"/>
       </w:pPr>
       <w:r>
@@ -1618,9 +1618,9 @@
     </w:p>
     <w:p>
       <w:pPr>
+        <w:keepNext/>
         <w:spacing w:before="0" w:after="0" w:line="240" w:lineRule="auto"/>
         <w:ind w:left="113"/>
-        <w:keepNext/>
         <w:shd w:val="clear" w:color="auto" w:fill="EEF1F5"/>
       </w:pPr>
       <w:r>
@@ -1634,10 +1634,10 @@
     </w:p>
     <w:p>
       <w:pPr>
+        <w:keepNext w:val="0"/>
         <w:spacing w:before="0" w:after="0" w:line="240" w:lineRule="auto"/>
         <w:ind w:left="113"/>
         <w:shd w:val="clear" w:color="auto" w:fill="EEF1F5"/>
-        <w:keepNext w:val="0"/>
         <w:pBdr>
           <w:bottom w:val="single" w:sz="4" w:space="3" w:color="DDE2E9"/>
         </w:pBdr>
@@ -1648,7 +1648,7 @@
           <w:color w:val="5A6575"/>
           <w:sz w:val="16"/>
         </w:rPr>
-        <w:t>#   AppID=APP_IFC_BSP_EVENT_PROCESSOR  Folder=Root  Object=sysEUWCorpDEngSit</w:t>
+        <w:t>#   AppID=APP_IFC_BSP_EVENT_PROCESSOR  Folder=Root  Object=INTRANET-sysEUWCorpDEngSit</w:t>
       </w:r>
     </w:p>
     <w:p>
@@ -1815,7 +1815,7 @@
           <w:color w:val="5A6575"/>
           <w:sz w:val="16"/>
         </w:rPr>
-        <w:t>utility/kafka_factory.py:262, :519 → bsp_python_client · BSPAuthenticator.get_config</w:t>
+        <w:t>utility/kafka_factory.py:268, :556 → bsp_python_client · BSPAuthenticator.get_config</w:t>
       </w:r>
     </w:p>
     <w:p>
@@ -1841,10 +1841,10 @@
     </w:p>
     <w:p>
       <w:pPr>
+        <w:keepNext/>
         <w:spacing w:before="0" w:after="0" w:line="240" w:lineRule="auto"/>
         <w:ind w:left="113"/>
         <w:shd w:val="clear" w:color="auto" w:fill="EEF1F5"/>
-        <w:keepNext/>
         <w:pBdr>
           <w:top w:val="single" w:sz="4" w:space="3" w:color="DDE2E9"/>
         </w:pBdr>
@@ -1860,9 +1860,9 @@
     </w:p>
     <w:p>
       <w:pPr>
+        <w:keepNext/>
         <w:spacing w:before="0" w:after="0" w:line="240" w:lineRule="auto"/>
         <w:ind w:left="113"/>
-        <w:keepNext/>
         <w:shd w:val="clear" w:color="auto" w:fill="EEF1F5"/>
       </w:pPr>
       <w:r>
@@ -1871,14 +1871,14 @@
           <w:color w:val="18202B"/>
           <w:sz w:val="16"/>
         </w:rPr>
-        <w:t>bootstrap.servers  = ldndsr000009490...:9095, ldndsr000009491...:9095, gbrdsr000012098...:9095</w:t>
+        <w:t>bootstrap.servers  = ldndsr000009480, ldndsr000009481, gbrdsr000011990,</w:t>
       </w:r>
     </w:p>
     <w:p>
       <w:pPr>
+        <w:keepNext/>
         <w:spacing w:before="0" w:after="0" w:line="240" w:lineRule="auto"/>
         <w:ind w:left="113"/>
-        <w:keepNext/>
         <w:shd w:val="clear" w:color="auto" w:fill="EEF1F5"/>
       </w:pPr>
       <w:r>
@@ -1887,14 +1887,14 @@
           <w:color w:val="18202B"/>
           <w:sz w:val="16"/>
         </w:rPr>
-        <w:t>security.protocol  = SASL_SSL</w:t>
+        <w:t xml:space="preserve">                     gbrdsr000011993, gbrdsr000013930 (.intranet.barcapint.com:9095)</w:t>
       </w:r>
     </w:p>
     <w:p>
       <w:pPr>
+        <w:keepNext/>
         <w:spacing w:before="0" w:after="0" w:line="240" w:lineRule="auto"/>
         <w:ind w:left="113"/>
-        <w:keepNext/>
         <w:shd w:val="clear" w:color="auto" w:fill="EEF1F5"/>
       </w:pPr>
       <w:r>
@@ -1903,14 +1903,14 @@
           <w:color w:val="18202B"/>
           <w:sz w:val="16"/>
         </w:rPr>
-        <w:t>sasl.mechanism     = OAUTHBEARER</w:t>
+        <w:t>security.protocol  = SASL_SSL</w:t>
       </w:r>
     </w:p>
     <w:p>
       <w:pPr>
+        <w:keepNext/>
         <w:spacing w:before="0" w:after="0" w:line="240" w:lineRule="auto"/>
         <w:ind w:left="113"/>
-        <w:keepNext/>
         <w:shd w:val="clear" w:color="auto" w:fill="EEF1F5"/>
       </w:pPr>
       <w:r>
@@ -1919,14 +1919,14 @@
           <w:color w:val="18202B"/>
           <w:sz w:val="16"/>
         </w:rPr>
-        <w:t>ssl.ca.location    = /tmp/ifc-certs/CARoot.pem</w:t>
+        <w:t>sasl.mechanism     = OAUTHBEARER</w:t>
       </w:r>
     </w:p>
     <w:p>
       <w:pPr>
+        <w:keepNext/>
         <w:spacing w:before="0" w:after="0" w:line="240" w:lineRule="auto"/>
         <w:ind w:left="113"/>
-        <w:keepNext/>
         <w:shd w:val="clear" w:color="auto" w:fill="EEF1F5"/>
       </w:pPr>
       <w:r>
@@ -1935,14 +1935,30 @@
           <w:color w:val="18202B"/>
           <w:sz w:val="16"/>
         </w:rPr>
-        <w:t>oauth_cb           = &lt;BSP callback that supplies the BAM token&gt;</w:t>
+        <w:t>ssl.ca.location    = /tmp/ifc-certs/CARoot.pem</w:t>
       </w:r>
     </w:p>
     <w:p>
       <w:pPr>
+        <w:keepNext/>
         <w:spacing w:before="0" w:after="0" w:line="240" w:lineRule="auto"/>
         <w:ind w:left="113"/>
+        <w:shd w:val="clear" w:color="auto" w:fill="EEF1F5"/>
+      </w:pPr>
+      <w:r>
+        <w:rPr>
+          <w:rFonts w:ascii="Consolas" w:hAnsi="Consolas"/>
+          <w:color w:val="18202B"/>
+          <w:sz w:val="16"/>
+        </w:rPr>
+        <w:t>oauth_cb           = &lt;BSP callback that supplies the BAM token&gt;</w:t>
+      </w:r>
+    </w:p>
+    <w:p>
+      <w:pPr>
         <w:keepNext/>
+        <w:spacing w:before="0" w:after="0" w:line="240" w:lineRule="auto"/>
+        <w:ind w:left="113"/>
         <w:shd w:val="clear" w:color="auto" w:fill="EEF1F5"/>
       </w:pPr>
       <w:r>
@@ -1956,10 +1972,10 @@
     </w:p>
     <w:p>
       <w:pPr>
+        <w:keepNext w:val="0"/>
         <w:spacing w:before="0" w:after="0" w:line="240" w:lineRule="auto"/>
         <w:ind w:left="113"/>
         <w:shd w:val="clear" w:color="auto" w:fill="EEF1F5"/>
-        <w:keepNext w:val="0"/>
         <w:pBdr>
           <w:bottom w:val="single" w:sz="4" w:space="3" w:color="DDE2E9"/>
         </w:pBdr>
@@ -2093,7 +2109,7 @@
           <w:color w:val="18202B"/>
           <w:sz w:val="19"/>
         </w:rPr>
-        <w:t xml:space="preserve">The next run logs this as </w:t>
+        <w:t xml:space="preserve">Log: </w:t>
       </w:r>
       <w:r>
         <w:rPr>
@@ -2101,7 +2117,7 @@
           <w:color w:val="18202B"/>
           <w:sz w:val="17"/>
         </w:rPr>
-        <w:t>Kafka client config: security.protocol=… ports=…</w:t>
+        <w:t>Kafka client config: security.protocol=SASL_SSL sasl.mechanism=OAUTHBEARER … (exists=True) brokers=5 ports=[9095]</w:t>
       </w:r>
     </w:p>
     <w:p>
@@ -2147,7 +2163,7 @@
           <w:color w:val="5A6575"/>
           <w:sz w:val="16"/>
         </w:rPr>
-        <w:t>utility/kafka_factory.py:522 · _network_checks → utility/kafka_preflight.py · check_dns, check_tcp</w:t>
+        <w:t>utility/kafka_factory.py:559 · _network_checks → utility/kafka_preflight.py · check_dns, check_tcp</w:t>
       </w:r>
     </w:p>
     <w:p>
@@ -2168,15 +2184,15 @@
           <w:color w:val="5A6575"/>
           <w:sz w:val="16"/>
         </w:rPr>
-        <w:t xml:space="preserve">   socket.getaddrinfo(host) · socket.create_connection((host, port), timeout=60)</w:t>
+        <w:t xml:space="preserve">   socket.getaddrinfo(host) · socket.create_connection((host, port), timeout=30)</w:t>
       </w:r>
     </w:p>
     <w:p>
       <w:pPr>
+        <w:keepNext/>
         <w:spacing w:before="0" w:after="0" w:line="240" w:lineRule="auto"/>
         <w:ind w:left="113"/>
         <w:shd w:val="clear" w:color="auto" w:fill="EEF1F5"/>
-        <w:keepNext/>
         <w:pBdr>
           <w:top w:val="single" w:sz="4" w:space="3" w:color="DDE2E9"/>
         </w:pBdr>
@@ -2192,9 +2208,9 @@
     </w:p>
     <w:p>
       <w:pPr>
+        <w:keepNext/>
         <w:spacing w:before="0" w:after="0" w:line="240" w:lineRule="auto"/>
         <w:ind w:left="113"/>
-        <w:keepNext/>
         <w:shd w:val="clear" w:color="auto" w:fill="EEF1F5"/>
       </w:pPr>
       <w:r>
@@ -2203,14 +2219,14 @@
           <w:color w:val="18202B"/>
           <w:sz w:val="16"/>
         </w:rPr>
-        <w:t>nslookup ldndsr000009490.intranet.barcapint.com</w:t>
+        <w:t>nslookup ldndsr000009480.intranet.barcapint.com</w:t>
       </w:r>
     </w:p>
     <w:p>
       <w:pPr>
+        <w:keepNext/>
         <w:spacing w:before="0" w:after="0" w:line="240" w:lineRule="auto"/>
         <w:ind w:left="113"/>
-        <w:keepNext/>
         <w:shd w:val="clear" w:color="auto" w:fill="EEF1F5"/>
       </w:pPr>
       <w:r>
@@ -2219,14 +2235,14 @@
           <w:color w:val="18202B"/>
           <w:sz w:val="16"/>
         </w:rPr>
-        <w:t>Test-NetConnection ldndsr000009490.intranet.barcapint.com -Port 9095   # or: nc -vz host 9095</w:t>
+        <w:t>Test-NetConnection ldndsr000009480.intranet.barcapint.com -Port 9095   # or: nc -vz host 9095</w:t>
       </w:r>
     </w:p>
     <w:p>
       <w:pPr>
+        <w:keepNext/>
         <w:spacing w:before="0" w:after="0" w:line="240" w:lineRule="auto"/>
         <w:ind w:left="113"/>
-        <w:keepNext/>
         <w:shd w:val="clear" w:color="auto" w:fill="EEF1F5"/>
       </w:pPr>
       <w:r>
@@ -2235,15 +2251,15 @@
           <w:color w:val="5A6575"/>
           <w:sz w:val="16"/>
         </w:rPr>
-        <w:t># ...repeated for ldndsr000009491:9095, gbrdsr000012098:9095,</w:t>
+        <w:t># ...repeated for the other four brokers on 9095,</w:t>
       </w:r>
     </w:p>
     <w:p>
       <w:pPr>
+        <w:keepNext w:val="0"/>
         <w:spacing w:before="0" w:after="0" w:line="240" w:lineRule="auto"/>
         <w:ind w:left="113"/>
         <w:shd w:val="clear" w:color="auto" w:fill="EEF1F5"/>
-        <w:keepNext w:val="0"/>
         <w:pBdr>
           <w:bottom w:val="single" w:sz="4" w:space="3" w:color="DDE2E9"/>
         </w:pBdr>
@@ -2254,7 +2270,7 @@
           <w:color w:val="5A6575"/>
           <w:sz w:val="16"/>
         </w:rPr>
-        <w:t>#    ldndsr000010177:8095 and gbrdsr00014551:8095</w:t>
+        <w:t>#    and ldndsr000010177:8095, gbrdsr000014551:8095 (Schema Registry)</w:t>
       </w:r>
     </w:p>
     <w:p>
@@ -2284,7 +2300,7 @@
           <w:color w:val="18202B"/>
           <w:sz w:val="19"/>
         </w:rPr>
-        <w:t xml:space="preserve"> (60).</w:t>
+        <w:t xml:space="preserve"> (30).</w:t>
       </w:r>
     </w:p>
     <w:p>
@@ -2306,7 +2322,7 @@
           <w:color w:val="18202B"/>
           <w:sz w:val="19"/>
         </w:rPr>
-        <w:t>IP addresses, and whether the TCP connect succeeded. One reachable broker is enough. Each failure is still reported.</w:t>
+        <w:t>IP addresses, and whether the TCP connect succeeded. One reachable node of each is enough. Each failure is still reported.</w:t>
       </w:r>
     </w:p>
     <w:p>
@@ -2335,7 +2351,23 @@
           <w:color w:val="18202B"/>
           <w:sz w:val="19"/>
         </w:rPr>
-        <w:t xml:space="preserve"> passed, all endpoints reachable</w:t>
+        <w:t xml:space="preserve"> 5/5 and </w:t>
+      </w:r>
+      <w:r>
+        <w:rPr>
+          <w:rFonts w:ascii="Consolas" w:hAnsi="Consolas"/>
+          <w:color w:val="18202B"/>
+          <w:sz w:val="17"/>
+        </w:rPr>
+        <w:t>tcp:schema_registry:quorum</w:t>
+      </w:r>
+      <w:r>
+        <w:rPr>
+          <w:b w:val="0"/>
+          <w:color w:val="18202B"/>
+          <w:sz w:val="19"/>
+        </w:rPr>
+        <w:t xml:space="preserve"> 2/2 endpoints reachable</w:t>
       </w:r>
     </w:p>
     <w:p>
@@ -2368,7 +2400,23 @@
           <w:color w:val="18202B"/>
           <w:sz w:val="21"/>
         </w:rPr>
-        <w:t>The BSP client exchanges the system-account credential for a BAM OAuth token (a JWT). The same token is used for the Schema Registry in step 9 and for SASL to the brokers in step 11.</w:t>
+        <w:t xml:space="preserve">The BSP client exchanges the system-account credential for a BAM OAuth token (a JWT), used here for the Schema Registry. The brokers get theirs from BSP's </w:t>
+      </w:r>
+      <w:r>
+        <w:rPr>
+          <w:rFonts w:ascii="Consolas" w:hAnsi="Consolas"/>
+          <w:color w:val="18202B"/>
+          <w:sz w:val="19"/>
+        </w:rPr>
+        <w:t>oauth_cb</w:t>
+      </w:r>
+      <w:r>
+        <w:rPr>
+          <w:b w:val="0"/>
+          <w:color w:val="18202B"/>
+          <w:sz w:val="21"/>
+        </w:rPr>
+        <w:t xml:space="preserve"> in step 11.</w:t>
       </w:r>
     </w:p>
     <w:p>
@@ -2381,7 +2429,7 @@
           <w:color w:val="5A6575"/>
           <w:sz w:val="16"/>
         </w:rPr>
-        <w:t>utility/kafka_factory.py:536 → utility/auth_helper.py:205 → bsp_python_client · BSPAuthenticator.get_token</w:t>
+        <w:t>utility/kafka_factory.py:573 → utility/auth_helper.py:205 → bsp_python_client · BSPAuthenticator.get_token</w:t>
       </w:r>
     </w:p>
     <w:p>
@@ -2407,10 +2455,10 @@
     </w:p>
     <w:p>
       <w:pPr>
+        <w:keepNext/>
         <w:spacing w:before="0" w:after="0" w:line="240" w:lineRule="auto"/>
         <w:ind w:left="113"/>
         <w:shd w:val="clear" w:color="auto" w:fill="EEF1F5"/>
-        <w:keepNext/>
         <w:pBdr>
           <w:top w:val="single" w:sz="4" w:space="3" w:color="DDE2E9"/>
         </w:pBdr>
@@ -2426,9 +2474,9 @@
     </w:p>
     <w:p>
       <w:pPr>
+        <w:keepNext/>
         <w:spacing w:before="0" w:after="0" w:line="240" w:lineRule="auto"/>
         <w:ind w:left="113"/>
-        <w:keepNext/>
         <w:shd w:val="clear" w:color="auto" w:fill="EEF1F5"/>
       </w:pPr>
       <w:r>
@@ -2437,14 +2485,78 @@
           <w:color w:val="18202B"/>
           <w:sz w:val="16"/>
         </w:rPr>
-        <w:t>BAM_URL       = &lt;BAM authentication endpoint&gt;</w:t>
+        <w:t>BAM_URL       = https://bamuat-auth.client.barclayscorp.com/authn/authenticate/sso/api   # UAT BAM</w:t>
       </w:r>
     </w:p>
     <w:p>
       <w:pPr>
+        <w:keepNext/>
         <w:spacing w:before="0" w:after="0" w:line="240" w:lineRule="auto"/>
         <w:ind w:left="113"/>
+        <w:shd w:val="clear" w:color="auto" w:fill="EEF1F5"/>
+      </w:pPr>
+      <w:r>
+        <w:rPr>
+          <w:rFonts w:ascii="Consolas" w:hAnsi="Consolas"/>
+          <w:color w:val="18202B"/>
+          <w:sz w:val="16"/>
+        </w:rPr>
+        <w:t>BAM_NAME      = BarclaysStreamingPlatform</w:t>
+      </w:r>
+    </w:p>
+    <w:p>
+      <w:pPr>
         <w:keepNext/>
+        <w:spacing w:before="0" w:after="0" w:line="240" w:lineRule="auto"/>
+        <w:ind w:left="113"/>
+        <w:shd w:val="clear" w:color="auto" w:fill="EEF1F5"/>
+      </w:pPr>
+      <w:r>
+        <w:rPr>
+          <w:rFonts w:ascii="Consolas" w:hAnsi="Consolas"/>
+          <w:color w:val="18202B"/>
+          <w:sz w:val="16"/>
+        </w:rPr>
+        <w:t>BSP_USERNAME  = sysEUWCorpDEngSit@INTRANET.BARCAPINT.COM   # from step 5</w:t>
+      </w:r>
+    </w:p>
+    <w:p>
+      <w:pPr>
+        <w:keepNext/>
+        <w:spacing w:before="0" w:after="0" w:line="240" w:lineRule="auto"/>
+        <w:ind w:left="113"/>
+        <w:shd w:val="clear" w:color="auto" w:fill="EEF1F5"/>
+      </w:pPr>
+      <w:r>
+        <w:rPr>
+          <w:rFonts w:ascii="Consolas" w:hAnsi="Consolas"/>
+          <w:color w:val="18202B"/>
+          <w:sz w:val="16"/>
+        </w:rPr>
+        <w:t>BSP_PASSWORD  = &lt;from CyberArk, step 5&gt;</w:t>
+      </w:r>
+    </w:p>
+    <w:p>
+      <w:pPr>
+        <w:keepNext/>
+        <w:spacing w:before="0" w:after="0" w:line="240" w:lineRule="auto"/>
+        <w:ind w:left="113"/>
+        <w:shd w:val="clear" w:color="auto" w:fill="EEF1F5"/>
+      </w:pPr>
+      <w:r>
+        <w:rPr>
+          <w:rFonts w:ascii="Consolas" w:hAnsi="Consolas"/>
+          <w:color w:val="18202B"/>
+          <w:sz w:val="16"/>
+        </w:rPr>
+        <w:t xml:space="preserve"> </w:t>
+      </w:r>
+    </w:p>
+    <w:p>
+      <w:pPr>
+        <w:keepNext/>
+        <w:spacing w:before="0" w:after="0" w:line="240" w:lineRule="auto"/>
+        <w:ind w:left="113"/>
         <w:shd w:val="clear" w:color="auto" w:fill="EEF1F5"/>
       </w:pPr>
       <w:r>
@@ -2453,79 +2565,18 @@
           <w:color w:val="5A6575"/>
           <w:sz w:val="16"/>
         </w:rPr>
-        <w:t xml:space="preserve">                # .env example: https://bamuat-auth.client.barclayscorp.com/authn/authenticate/sso/api</w:t>
+        <w:t># Our call:  BSPAuthenticator().get_token(producer_config)</w:t>
       </w:r>
     </w:p>
     <w:p>
       <w:pPr>
+        <w:keepNext w:val="0"/>
         <w:spacing w:before="0" w:after="0" w:line="240" w:lineRule="auto"/>
         <w:ind w:left="113"/>
-        <w:keepNext/>
         <w:shd w:val="clear" w:color="auto" w:fill="EEF1F5"/>
-      </w:pPr>
-      <w:r>
-        <w:rPr>
-          <w:rFonts w:ascii="Consolas" w:hAnsi="Consolas"/>
-          <w:color w:val="18202B"/>
-          <w:sz w:val="16"/>
-        </w:rPr>
-        <w:t>BAM_NAME      = BarclaysStreamingPlatform</w:t>
-      </w:r>
-    </w:p>
-    <w:p>
-      <w:pPr>
-        <w:spacing w:before="0" w:after="0" w:line="240" w:lineRule="auto"/>
-        <w:ind w:left="113"/>
-        <w:keepNext/>
-        <w:shd w:val="clear" w:color="auto" w:fill="EEF1F5"/>
-      </w:pPr>
-      <w:r>
-        <w:rPr>
-          <w:rFonts w:ascii="Consolas" w:hAnsi="Consolas"/>
-          <w:color w:val="18202B"/>
-          <w:sz w:val="16"/>
-        </w:rPr>
-        <w:t>BSP_USERNAME  = sysEUWCorpDEngSit@INTRANET.BARCAPINT.COM   # from step 5</w:t>
-      </w:r>
-    </w:p>
-    <w:p>
-      <w:pPr>
-        <w:spacing w:before="0" w:after="0" w:line="240" w:lineRule="auto"/>
-        <w:ind w:left="113"/>
-        <w:keepNext/>
-        <w:shd w:val="clear" w:color="auto" w:fill="EEF1F5"/>
-      </w:pPr>
-      <w:r>
-        <w:rPr>
-          <w:rFonts w:ascii="Consolas" w:hAnsi="Consolas"/>
-          <w:color w:val="18202B"/>
-          <w:sz w:val="16"/>
-        </w:rPr>
-        <w:t>BSP_PASSWORD  = &lt;from CyberArk, step 5&gt;</w:t>
-      </w:r>
-    </w:p>
-    <w:p>
-      <w:pPr>
-        <w:spacing w:before="0" w:after="0" w:line="240" w:lineRule="auto"/>
-        <w:ind w:left="113"/>
-        <w:keepNext/>
-        <w:shd w:val="clear" w:color="auto" w:fill="EEF1F5"/>
-      </w:pPr>
-      <w:r>
-        <w:rPr>
-          <w:rFonts w:ascii="Consolas" w:hAnsi="Consolas"/>
-          <w:color w:val="18202B"/>
-          <w:sz w:val="16"/>
-        </w:rPr>
-        <w:t xml:space="preserve"> </w:t>
-      </w:r>
-    </w:p>
-    <w:p>
-      <w:pPr>
-        <w:spacing w:before="0" w:after="0" w:line="240" w:lineRule="auto"/>
-        <w:ind w:left="113"/>
-        <w:keepNext/>
-        <w:shd w:val="clear" w:color="auto" w:fill="EEF1F5"/>
+        <w:pBdr>
+          <w:bottom w:val="single" w:sz="4" w:space="3" w:color="DDE2E9"/>
+        </w:pBdr>
       </w:pPr>
       <w:r>
         <w:rPr>
@@ -2533,42 +2584,7 @@
           <w:color w:val="5A6575"/>
           <w:sz w:val="16"/>
         </w:rPr>
-        <w:t># Our call:  BSPAuthenticator().get_token(producer_config)</w:t>
-      </w:r>
-    </w:p>
-    <w:p>
-      <w:pPr>
-        <w:spacing w:before="0" w:after="0" w:line="240" w:lineRule="auto"/>
-        <w:ind w:left="113"/>
-        <w:keepNext/>
-        <w:shd w:val="clear" w:color="auto" w:fill="EEF1F5"/>
-      </w:pPr>
-      <w:r>
-        <w:rPr>
-          <w:rFonts w:ascii="Consolas" w:hAnsi="Consolas"/>
-          <w:color w:val="5A6575"/>
-          <w:sz w:val="16"/>
-        </w:rPr>
-        <w:t># The HTTP request to BAM is built inside the proprietary BSP library, so its exact</w:t>
-      </w:r>
-    </w:p>
-    <w:p>
-      <w:pPr>
-        <w:spacing w:before="0" w:after="0" w:line="240" w:lineRule="auto"/>
-        <w:ind w:left="113"/>
-        <w:shd w:val="clear" w:color="auto" w:fill="EEF1F5"/>
-        <w:keepNext w:val="0"/>
-        <w:pBdr>
-          <w:bottom w:val="single" w:sz="4" w:space="3" w:color="DDE2E9"/>
-        </w:pBdr>
-      </w:pPr>
-      <w:r>
-        <w:rPr>
-          <w:rFonts w:ascii="Consolas" w:hAnsi="Consolas"/>
-          <w:color w:val="5A6575"/>
-          <w:sz w:val="16"/>
-        </w:rPr>
-        <w:t># shape is not visible here; the BSP team can confirm it.</w:t>
+        <w:t># The HTTP request to BAM is built inside the proprietary BSP library.</w:t>
       </w:r>
     </w:p>
     <w:p>
@@ -2590,7 +2606,7 @@
           <w:color w:val="18202B"/>
           <w:sz w:val="19"/>
         </w:rPr>
-        <w:t xml:space="preserve">A JWT. The connector reads its </w:t>
+        <w:t xml:space="preserve">A JWT with </w:t>
       </w:r>
       <w:r>
         <w:rPr>
@@ -2598,7 +2614,7 @@
           <w:color w:val="18202B"/>
           <w:sz w:val="17"/>
         </w:rPr>
-        <w:t>exp</w:t>
+        <w:t>sub=sysEUWCorpDEngSit@INTRANET.BARCAPINT.COM</w:t>
       </w:r>
       <w:r>
         <w:rPr>
@@ -2606,20 +2622,23 @@
           <w:color w:val="18202B"/>
           <w:sz w:val="19"/>
         </w:rPr>
-        <w:t xml:space="preserve"> claim, which showed 12 hours, and refreshes the token 300 seconds before expiry.</w:t>
-      </w:r>
-    </w:p>
-    <w:p>
-      <w:pPr>
-        <w:spacing w:before="80" w:after="80"/>
-      </w:pPr>
+        <w:t xml:space="preserve">, </w:t>
+      </w:r>
+      <w:r>
+        <w:rPr>
+          <w:rFonts w:ascii="Consolas" w:hAnsi="Consolas"/>
+          <w:color w:val="18202B"/>
+          <w:sz w:val="17"/>
+        </w:rPr>
+        <w:t>iss=BAM</w:t>
+      </w:r>
       <w:r>
         <w:rPr>
           <w:b w:val="0"/>
           <w:color w:val="18202B"/>
           <w:sz w:val="19"/>
         </w:rPr>
-        <w:t xml:space="preserve">Log: </w:t>
+        <w:t xml:space="preserve">, </w:t>
       </w:r>
       <w:r>
         <w:rPr>
@@ -2627,7 +2646,7 @@
           <w:color w:val="18202B"/>
           <w:sz w:val="17"/>
         </w:rPr>
-        <w:t>Fetching New BAM Token</w:t>
+        <w:t>aud=BarclaysStreamingPlatform</w:t>
       </w:r>
       <w:r>
         <w:rPr>
@@ -2635,7 +2654,20 @@
           <w:color w:val="18202B"/>
           <w:sz w:val="19"/>
         </w:rPr>
-        <w:t xml:space="preserve">, </w:t>
+        <w:t>, valid 12 hours. The connector refreshes it 300 seconds before expiry.</w:t>
+      </w:r>
+    </w:p>
+    <w:p>
+      <w:pPr>
+        <w:spacing w:before="80" w:after="80"/>
+      </w:pPr>
+      <w:r>
+        <w:rPr>
+          <w:b w:val="0"/>
+          <w:color w:val="18202B"/>
+          <w:sz w:val="19"/>
+        </w:rPr>
+        <w:t xml:space="preserve">Log: </w:t>
       </w:r>
       <w:r>
         <w:rPr>
@@ -2643,7 +2675,7 @@
           <w:color w:val="18202B"/>
           <w:sz w:val="17"/>
         </w:rPr>
-        <w:t>BAM token acquired</w:t>
+        <w:t>Fetching New BAM Token</w:t>
       </w:r>
       <w:r>
         <w:rPr>
@@ -2659,7 +2691,23 @@
           <w:color w:val="18202B"/>
           <w:sz w:val="17"/>
         </w:rPr>
-        <w:t>expires_in_seconds=43200</w:t>
+        <w:t>BAM token acquired</w:t>
+      </w:r>
+      <w:r>
+        <w:rPr>
+          <w:b w:val="0"/>
+          <w:color w:val="18202B"/>
+          <w:sz w:val="19"/>
+        </w:rPr>
+        <w:t xml:space="preserve">, </w:t>
+      </w:r>
+      <w:r>
+        <w:rPr>
+          <w:rFonts w:ascii="Consolas" w:hAnsi="Consolas"/>
+          <w:color w:val="18202B"/>
+          <w:sz w:val="17"/>
+        </w:rPr>
+        <w:t>expires_in_seconds=43199</w:t>
       </w:r>
     </w:p>
     <w:p>
@@ -2705,7 +2753,7 @@
           <w:color w:val="5A6575"/>
           <w:sz w:val="16"/>
         </w:rPr>
-        <w:t>utility/kafka_factory.py:541 → _resolve_schema (:372) → utility/schema_registry_client.py · latest_schema</w:t>
+        <w:t>utility/kafka_factory.py:578 → _resolve_schema (:378) → utility/schema_registry_client.py · latest_schema</w:t>
       </w:r>
     </w:p>
     <w:p>
@@ -2731,10 +2779,10 @@
     </w:p>
     <w:p>
       <w:pPr>
+        <w:keepNext/>
         <w:spacing w:before="0" w:after="0" w:line="240" w:lineRule="auto"/>
         <w:ind w:left="113"/>
         <w:shd w:val="clear" w:color="auto" w:fill="EEF1F5"/>
-        <w:keepNext/>
         <w:pBdr>
           <w:top w:val="single" w:sz="4" w:space="3" w:color="DDE2E9"/>
         </w:pBdr>
@@ -2750,9 +2798,9 @@
     </w:p>
     <w:p>
       <w:pPr>
+        <w:keepNext/>
         <w:spacing w:before="0" w:after="0" w:line="240" w:lineRule="auto"/>
         <w:ind w:left="113"/>
-        <w:keepNext/>
         <w:shd w:val="clear" w:color="auto" w:fill="EEF1F5"/>
       </w:pPr>
       <w:r>
@@ -2766,9 +2814,9 @@
     </w:p>
     <w:p>
       <w:pPr>
+        <w:keepNext/>
         <w:spacing w:before="0" w:after="0" w:line="240" w:lineRule="auto"/>
         <w:ind w:left="113"/>
-        <w:keepNext/>
         <w:shd w:val="clear" w:color="auto" w:fill="EEF1F5"/>
       </w:pPr>
       <w:r>
@@ -2782,9 +2830,9 @@
     </w:p>
     <w:p>
       <w:pPr>
+        <w:keepNext/>
         <w:spacing w:before="0" w:after="0" w:line="240" w:lineRule="auto"/>
         <w:ind w:left="113"/>
-        <w:keepNext/>
         <w:shd w:val="clear" w:color="auto" w:fill="EEF1F5"/>
       </w:pPr>
       <w:r>
@@ -2798,9 +2846,9 @@
     </w:p>
     <w:p>
       <w:pPr>
+        <w:keepNext/>
         <w:spacing w:before="0" w:after="0" w:line="240" w:lineRule="auto"/>
         <w:ind w:left="113"/>
-        <w:keepNext/>
         <w:shd w:val="clear" w:color="auto" w:fill="EEF1F5"/>
       </w:pPr>
       <w:r>
@@ -2814,10 +2862,10 @@
     </w:p>
     <w:p>
       <w:pPr>
+        <w:keepNext w:val="0"/>
         <w:spacing w:before="0" w:after="0" w:line="240" w:lineRule="auto"/>
         <w:ind w:left="113"/>
         <w:shd w:val="clear" w:color="auto" w:fill="EEF1F5"/>
-        <w:keepNext w:val="0"/>
         <w:pBdr>
           <w:bottom w:val="single" w:sz="4" w:space="3" w:color="DDE2E9"/>
         </w:pBdr>
@@ -2828,7 +2876,7 @@
           <w:color w:val="5A6575"/>
           <w:sz w:val="16"/>
         </w:rPr>
-        <w:t># on a connection error or 5xx, the same request to https://gbrdsr00014551.intranet.barcapint.com:8095</w:t>
+        <w:t># on a connection error or 5xx, the same request to https://gbrdsr000014551.intranet.barcapint.com:8095</w:t>
       </w:r>
     </w:p>
     <w:p>
@@ -2874,7 +2922,7 @@
           <w:color w:val="18202B"/>
           <w:sz w:val="19"/>
         </w:rPr>
-        <w:t xml:space="preserve"> goes into every record (step 15).</w:t>
+        <w:t xml:space="preserve"> goes into every record (step 16).</w:t>
       </w:r>
     </w:p>
     <w:p>
@@ -2919,7 +2967,39 @@
           <w:color w:val="18202B"/>
           <w:sz w:val="19"/>
         </w:rPr>
-        <w:t>. One informational note: the record's namespace differs from the registry's. Avro matches by field, so this is harmless.</w:t>
+        <w:t>. Informational: the record's namespace differs from the registry's (</w:t>
+      </w:r>
+      <w:r>
+        <w:rPr>
+          <w:rFonts w:ascii="Consolas" w:hAnsi="Consolas"/>
+          <w:color w:val="18202B"/>
+          <w:sz w:val="17"/>
+        </w:rPr>
+        <w:t>.TriggerBackboneTopicSchema</w:t>
+      </w:r>
+      <w:r>
+        <w:rPr>
+          <w:b w:val="0"/>
+          <w:color w:val="18202B"/>
+          <w:sz w:val="19"/>
+        </w:rPr>
+        <w:t xml:space="preserve"> vs </w:t>
+      </w:r>
+      <w:r>
+        <w:rPr>
+          <w:rFonts w:ascii="Consolas" w:hAnsi="Consolas"/>
+          <w:color w:val="18202B"/>
+          <w:sz w:val="17"/>
+        </w:rPr>
+        <w:t>com.barclays.trigger.backbone.producer.bsp.schema.model.TriggerBackboneTopicSchema</w:t>
+      </w:r>
+      <w:r>
+        <w:rPr>
+          <w:b w:val="0"/>
+          <w:color w:val="18202B"/>
+          <w:sz w:val="19"/>
+        </w:rPr>
+        <w:t>). Avro matches by field; the consumer team should confirm they decode it.</w:t>
       </w:r>
     </w:p>
     <w:p>
@@ -2981,43 +3061,51 @@
           <w:color w:val="5A6575"/>
           <w:sz w:val="16"/>
         </w:rPr>
-        <w:t>utility/kafka_factory.py:544 · confluent_kafka.Producer(config)</w:t>
+        <w:t>utility/kafka_factory.py:581 · confluent_kafka.Producer(config)</w:t>
       </w:r>
     </w:p>
     <w:p>
       <w:pPr>
         <w:pStyle w:val="Heading2"/>
         <w:pBdr>
-          <w:left w:val="single" w:sz="18" w:space="6" w:color="B42318"/>
+          <w:left w:val="single" w:sz="18" w:space="6" w:color="1F5F8B"/>
         </w:pBdr>
       </w:pPr>
       <w:r>
         <w:rPr>
-          <w:color w:val="B42318"/>
-        </w:rPr>
-        <w:t>11.  Topic metadata from the brokers</w:t>
+          <w:color w:val="1F5F8B"/>
+        </w:rPr>
+        <w:t>11.  Hand the BAM token to librdkafka</w:t>
       </w:r>
       <w:r>
         <w:rPr>
           <w:b/>
-          <w:color w:val="B42318"/>
+          <w:color w:val="1F5F8B"/>
           <w:sz w:val="17"/>
           <w:spacing w:val="15"/>
         </w:rPr>
-        <w:t xml:space="preserve">   FAILED</w:t>
+        <w:t xml:space="preserve">   FIXED</w:t>
       </w:r>
     </w:p>
     <w:p>
       <w:pPr>
         <w:spacing w:before="0" w:after="40"/>
       </w:pPr>
+      <w:r>
+        <w:rPr>
+          <w:b/>
+          <w:color w:val="18202B"/>
+          <w:sz w:val="21"/>
+        </w:rPr>
+        <w:t>The fix.</w:t>
+      </w:r>
       <w:r>
         <w:rPr>
           <w:b w:val="0"/>
           <w:color w:val="18202B"/>
           <w:sz w:val="21"/>
         </w:rPr>
-        <w:t xml:space="preserve">The first real Kafka conversation. librdkafka runs this sequence on one connection, trying each broker in turn until one answers or the timeout passes. If none gets through, it reports </w:t>
+        <w:t xml:space="preserve"> On confluent-kafka 2.4, BSP's </w:t>
       </w:r>
       <w:r>
         <w:rPr>
@@ -3025,7 +3113,7 @@
           <w:color w:val="18202B"/>
           <w:sz w:val="19"/>
         </w:rPr>
-        <w:t>_TRANSPORT</w:t>
+        <w:t>oauth_cb</w:t>
       </w:r>
       <w:r>
         <w:rPr>
@@ -3033,7 +3121,39 @@
           <w:color w:val="18202B"/>
           <w:sz w:val="21"/>
         </w:rPr>
-        <w:t>.</w:t>
+        <w:t xml:space="preserve"> runs only inside </w:t>
+      </w:r>
+      <w:r>
+        <w:rPr>
+          <w:rFonts w:ascii="Consolas" w:hAnsi="Consolas"/>
+          <w:color w:val="18202B"/>
+          <w:sz w:val="19"/>
+        </w:rPr>
+        <w:t>poll()</w:t>
+      </w:r>
+      <w:r>
+        <w:rPr>
+          <w:b w:val="0"/>
+          <w:color w:val="18202B"/>
+          <w:sz w:val="21"/>
+        </w:rPr>
+        <w:t xml:space="preserve"> or </w:t>
+      </w:r>
+      <w:r>
+        <w:rPr>
+          <w:rFonts w:ascii="Consolas" w:hAnsi="Consolas"/>
+          <w:color w:val="18202B"/>
+          <w:sz w:val="19"/>
+        </w:rPr>
+        <w:t>flush()</w:t>
+      </w:r>
+      <w:r>
+        <w:rPr>
+          <w:b w:val="0"/>
+          <w:color w:val="18202B"/>
+          <w:sz w:val="21"/>
+        </w:rPr>
+        <w:t>. The producer is polled until the callback has returned an unexpired token, so every broker connection can authenticate. Before this step existed, nothing polled until the failure path, 60 seconds too late.</w:t>
       </w:r>
     </w:p>
     <w:p>
@@ -3046,7 +3166,7 @@
           <w:color w:val="5A6575"/>
           <w:sz w:val="16"/>
         </w:rPr>
-        <w:t>utility/kafka_factory.py:547 → _metadata_checks (:448) → producer.list_topics (:453); result recorded by utility/kafka_preflight.py · check_topic_metadata</w:t>
+        <w:t>utility/kafka_factory.py:583 → _await_oauth_token (:455), _observed_oauth_cb</w:t>
       </w:r>
     </w:p>
     <w:p>
@@ -3059,7 +3179,7 @@
           <w:b/>
           <w:sz w:val="19"/>
         </w:rPr>
-        <w:t>Sends to Kafka broker, port 9095</w:t>
+        <w:t>Sends to librdkafka, in the process</w:t>
       </w:r>
       <w:r>
         <w:rPr>
@@ -3067,15 +3187,15 @@
           <w:color w:val="5A6575"/>
           <w:sz w:val="16"/>
         </w:rPr>
-        <w:t xml:space="preserve">   librdkafka · Kafka protocol over SASL_SSL</w:t>
+        <w:t xml:space="preserve">   producer.poll(0.1) until oauth_cb has supplied a token (up to 15 s)</w:t>
       </w:r>
     </w:p>
     <w:p>
       <w:pPr>
+        <w:keepNext/>
         <w:spacing w:before="0" w:after="0" w:line="240" w:lineRule="auto"/>
         <w:ind w:left="113"/>
         <w:shd w:val="clear" w:color="auto" w:fill="EEF1F5"/>
-        <w:keepNext/>
         <w:pBdr>
           <w:top w:val="single" w:sz="4" w:space="3" w:color="DDE2E9"/>
         </w:pBdr>
@@ -3083,17 +3203,49 @@
       <w:r>
         <w:rPr>
           <w:rFonts w:ascii="Consolas" w:hAnsi="Consolas"/>
-          <w:color w:val="5A6575"/>
+          <w:color w:val="18202B"/>
           <w:sz w:val="16"/>
         </w:rPr>
-        <w:t># 1. TCP connect              -&gt; ldndsr000009490.intranet.barcapint.com:9095</w:t>
+        <w:t>while not token_supplied and waited &lt; 15 s:</w:t>
       </w:r>
     </w:p>
     <w:p>
       <w:pPr>
+        <w:keepNext/>
         <w:spacing w:before="0" w:after="0" w:line="240" w:lineRule="auto"/>
         <w:ind w:left="113"/>
+        <w:shd w:val="clear" w:color="auto" w:fill="EEF1F5"/>
+      </w:pPr>
+      <w:r>
+        <w:rPr>
+          <w:rFonts w:ascii="Consolas" w:hAnsi="Consolas"/>
+          <w:color w:val="18202B"/>
+          <w:sz w:val="16"/>
+        </w:rPr>
+        <w:t xml:space="preserve">    producer.poll(0.1)            # serves BSP's oauth_cb on confluent-kafka 2.4</w:t>
+      </w:r>
+    </w:p>
+    <w:p>
+      <w:pPr>
         <w:keepNext/>
+        <w:spacing w:before="0" w:after="0" w:line="240" w:lineRule="auto"/>
+        <w:ind w:left="113"/>
+        <w:shd w:val="clear" w:color="auto" w:fill="EEF1F5"/>
+      </w:pPr>
+      <w:r>
+        <w:rPr>
+          <w:rFonts w:ascii="Consolas" w:hAnsi="Consolas"/>
+          <w:color w:val="18202B"/>
+          <w:sz w:val="16"/>
+        </w:rPr>
+        <w:t xml:space="preserve"> </w:t>
+      </w:r>
+    </w:p>
+    <w:p>
+      <w:pPr>
+        <w:keepNext/>
+        <w:spacing w:before="0" w:after="0" w:line="240" w:lineRule="auto"/>
+        <w:ind w:left="113"/>
         <w:shd w:val="clear" w:color="auto" w:fill="EEF1F5"/>
       </w:pPr>
       <w:r>
@@ -3102,15 +3254,18 @@
           <w:color w:val="5A6575"/>
           <w:sz w:val="16"/>
         </w:rPr>
-        <w:t># 2. TLS ClientHello (SNI)    -&gt; broker certificate checked against /tmp/ifc-certs/CARoot.pem,</w:t>
+        <w:t># oauth_cb returns   ("&lt;BAM JWT&gt;", &lt;expiry, epoch seconds&gt;)</w:t>
       </w:r>
     </w:p>
     <w:p>
       <w:pPr>
+        <w:keepNext w:val="0"/>
         <w:spacing w:before="0" w:after="0" w:line="240" w:lineRule="auto"/>
         <w:ind w:left="113"/>
-        <w:keepNext/>
         <w:shd w:val="clear" w:color="auto" w:fill="EEF1F5"/>
+        <w:pBdr>
+          <w:bottom w:val="single" w:sz="4" w:space="3" w:color="DDE2E9"/>
+        </w:pBdr>
       </w:pPr>
       <w:r>
         <w:rPr>
@@ -3118,202 +3273,7 @@
           <w:color w:val="5A6575"/>
           <w:sz w:val="16"/>
         </w:rPr>
-        <w:t>#                                and its name against the host</w:t>
-      </w:r>
-    </w:p>
-    <w:p>
-      <w:pPr>
-        <w:spacing w:before="0" w:after="0" w:line="240" w:lineRule="auto"/>
-        <w:ind w:left="113"/>
-        <w:keepNext/>
-        <w:shd w:val="clear" w:color="auto" w:fill="EEF1F5"/>
-      </w:pPr>
-      <w:r>
-        <w:rPr>
-          <w:rFonts w:ascii="Consolas" w:hAnsi="Consolas"/>
-          <w:color w:val="5A6575"/>
-          <w:sz w:val="16"/>
-        </w:rPr>
-        <w:t># 3. ApiVersionsRequest       -&gt; which protocol versions the broker speaks</w:t>
-      </w:r>
-    </w:p>
-    <w:p>
-      <w:pPr>
-        <w:spacing w:before="0" w:after="0" w:line="240" w:lineRule="auto"/>
-        <w:ind w:left="113"/>
-        <w:keepNext/>
-        <w:shd w:val="clear" w:color="auto" w:fill="EEF1F5"/>
-      </w:pPr>
-      <w:r>
-        <w:rPr>
-          <w:rFonts w:ascii="Consolas" w:hAnsi="Consolas"/>
-          <w:color w:val="5A6575"/>
-          <w:sz w:val="16"/>
-        </w:rPr>
-        <w:t># 4. SaslHandshakeRequest     -&gt; mechanism = OAUTHBEARER</w:t>
-      </w:r>
-    </w:p>
-    <w:p>
-      <w:pPr>
-        <w:spacing w:before="0" w:after="0" w:line="240" w:lineRule="auto"/>
-        <w:ind w:left="113"/>
-        <w:keepNext/>
-        <w:shd w:val="clear" w:color="auto" w:fill="EEF1F5"/>
-      </w:pPr>
-      <w:r>
-        <w:rPr>
-          <w:rFonts w:ascii="Consolas" w:hAnsi="Consolas"/>
-          <w:color w:val="5A6575"/>
-          <w:sz w:val="16"/>
-        </w:rPr>
-        <w:t># 5. SaslAuthenticateRequest  -&gt; "n,,\x01auth=Bearer &lt;BAM JWT from oauth_cb&gt;\x01\x01"</w:t>
-      </w:r>
-    </w:p>
-    <w:p>
-      <w:pPr>
-        <w:spacing w:before="0" w:after="0" w:line="240" w:lineRule="auto"/>
-        <w:ind w:left="113"/>
-        <w:keepNext/>
-        <w:shd w:val="clear" w:color="auto" w:fill="EEF1F5"/>
-      </w:pPr>
-      <w:r>
-        <w:rPr>
-          <w:rFonts w:ascii="Consolas" w:hAnsi="Consolas"/>
-          <w:color w:val="5A6575"/>
-          <w:sz w:val="16"/>
-        </w:rPr>
-        <w:t>#                                the broker validates the token: principal sysEUWCorpDEngSit@...</w:t>
-      </w:r>
-    </w:p>
-    <w:p>
-      <w:pPr>
-        <w:spacing w:before="0" w:after="0" w:line="240" w:lineRule="auto"/>
-        <w:ind w:left="113"/>
-        <w:keepNext/>
-        <w:shd w:val="clear" w:color="auto" w:fill="EEF1F5"/>
-      </w:pPr>
-      <w:r>
-        <w:rPr>
-          <w:rFonts w:ascii="Consolas" w:hAnsi="Consolas"/>
-          <w:color w:val="5A6575"/>
-          <w:sz w:val="16"/>
-        </w:rPr>
-        <w:t># 6. MetadataRequest          -&gt; topics=[tc01_fncmtrgrbb_ifc_tbb_kyc_refresh]</w:t>
-      </w:r>
-    </w:p>
-    <w:p>
-      <w:pPr>
-        <w:spacing w:before="0" w:after="0" w:line="240" w:lineRule="auto"/>
-        <w:ind w:left="113"/>
-        <w:keepNext/>
-        <w:shd w:val="clear" w:color="auto" w:fill="EEF1F5"/>
-      </w:pPr>
-      <w:r>
-        <w:rPr>
-          <w:rFonts w:ascii="Consolas" w:hAnsi="Consolas"/>
-          <w:color w:val="5A6575"/>
-          <w:sz w:val="16"/>
-        </w:rPr>
-        <w:t>#                                needs the topic to exist and DESCRIBE for the principal</w:t>
-      </w:r>
-    </w:p>
-    <w:p>
-      <w:pPr>
-        <w:spacing w:before="0" w:after="0" w:line="240" w:lineRule="auto"/>
-        <w:ind w:left="113"/>
-        <w:keepNext/>
-        <w:shd w:val="clear" w:color="auto" w:fill="EEF1F5"/>
-      </w:pPr>
-      <w:r>
-        <w:rPr>
-          <w:rFonts w:ascii="Consolas" w:hAnsi="Consolas"/>
-          <w:color w:val="18202B"/>
-          <w:sz w:val="16"/>
-        </w:rPr>
-        <w:t xml:space="preserve"> </w:t>
-      </w:r>
-    </w:p>
-    <w:p>
-      <w:pPr>
-        <w:spacing w:before="0" w:after="0" w:line="240" w:lineRule="auto"/>
-        <w:ind w:left="113"/>
-        <w:keepNext/>
-        <w:shd w:val="clear" w:color="auto" w:fill="EEF1F5"/>
-      </w:pPr>
-      <w:r>
-        <w:rPr>
-          <w:rFonts w:ascii="Consolas" w:hAnsi="Consolas"/>
-          <w:color w:val="5A6575"/>
-          <w:sz w:val="16"/>
-        </w:rPr>
-        <w:t># Hop 2 can be reproduced by hand:</w:t>
-      </w:r>
-    </w:p>
-    <w:p>
-      <w:pPr>
-        <w:spacing w:before="0" w:after="0" w:line="240" w:lineRule="auto"/>
-        <w:ind w:left="113"/>
-        <w:keepNext/>
-        <w:shd w:val="clear" w:color="auto" w:fill="EEF1F5"/>
-      </w:pPr>
-      <w:r>
-        <w:rPr>
-          <w:rFonts w:ascii="Consolas" w:hAnsi="Consolas"/>
-          <w:color w:val="18202B"/>
-          <w:sz w:val="16"/>
-        </w:rPr>
-        <w:t>openssl s_client -connect ldndsr000009490.intranet.barcapint.com:9095 \</w:t>
-      </w:r>
-    </w:p>
-    <w:p>
-      <w:pPr>
-        <w:spacing w:before="0" w:after="0" w:line="240" w:lineRule="auto"/>
-        <w:ind w:left="113"/>
-        <w:keepNext/>
-        <w:shd w:val="clear" w:color="auto" w:fill="EEF1F5"/>
-      </w:pPr>
-      <w:r>
-        <w:rPr>
-          <w:rFonts w:ascii="Consolas" w:hAnsi="Consolas"/>
-          <w:color w:val="18202B"/>
-          <w:sz w:val="16"/>
-        </w:rPr>
-        <w:t xml:space="preserve">  -servername ldndsr000009490.intranet.barcapint.com -CAfile CARoot.pem</w:t>
-      </w:r>
-    </w:p>
-    <w:p>
-      <w:pPr>
-        <w:spacing w:before="0" w:after="0" w:line="240" w:lineRule="auto"/>
-        <w:ind w:left="113"/>
-        <w:keepNext/>
-        <w:shd w:val="clear" w:color="auto" w:fill="EEF1F5"/>
-      </w:pPr>
-      <w:r>
-        <w:rPr>
-          <w:rFonts w:ascii="Consolas" w:hAnsi="Consolas"/>
-          <w:color w:val="5A6575"/>
-          <w:sz w:val="16"/>
-        </w:rPr>
-        <w:t># Hops 4-6 need the BAM token from BSP's callback; the Trigger Backbone team's</w:t>
-      </w:r>
-    </w:p>
-    <w:p>
-      <w:pPr>
-        <w:spacing w:before="0" w:after="0" w:line="240" w:lineRule="auto"/>
-        <w:ind w:left="113"/>
-        <w:shd w:val="clear" w:color="auto" w:fill="EEF1F5"/>
-        <w:keepNext w:val="0"/>
-        <w:pBdr>
-          <w:bottom w:val="single" w:sz="4" w:space="3" w:color="DDE2E9"/>
-        </w:pBdr>
-      </w:pPr>
-      <w:r>
-        <w:rPr>
-          <w:rFonts w:ascii="Consolas" w:hAnsi="Consolas"/>
-          <w:color w:val="5A6575"/>
-          <w:sz w:val="16"/>
-        </w:rPr>
-        <w:t># Java client can run the same metadata request for comparison.</w:t>
+        <w:t># librdkafka stores the token and wakes the broker threads</w:t>
       </w:r>
     </w:p>
     <w:p>
@@ -3327,7 +3287,28 @@
           <w:color w:val="5A6575"/>
           <w:sz w:val="16"/>
         </w:rPr>
-        <w:t xml:space="preserve">USES   </w:t>
+        <w:t xml:space="preserve">GETS BACK   </w:t>
+      </w:r>
+      <w:r>
+        <w:rPr>
+          <w:b w:val="0"/>
+          <w:color w:val="18202B"/>
+          <w:sz w:val="19"/>
+        </w:rPr>
+        <w:t>The token in librdkafka. Its claims and expiry are logged, never the token itself.</w:t>
+      </w:r>
+    </w:p>
+    <w:p>
+      <w:pPr>
+        <w:spacing w:before="80" w:after="80"/>
+      </w:pPr>
+      <w:r>
+        <w:rPr>
+          <w:b w:val="0"/>
+          <w:color w:val="18202B"/>
+          <w:sz w:val="19"/>
+        </w:rPr>
+        <w:t xml:space="preserve">Log: </w:t>
       </w:r>
       <w:r>
         <w:rPr>
@@ -3335,7 +3316,7 @@
           <w:color w:val="18202B"/>
           <w:sz w:val="17"/>
         </w:rPr>
-        <w:t>resilience.preflight_metadata_timeout_seconds</w:t>
+        <w:t>oauth_cb supplied a token: shape=2-tuple … expires_in_seconds≈43200</w:t>
       </w:r>
       <w:r>
         <w:rPr>
@@ -3343,84 +3324,26 @@
           <w:color w:val="18202B"/>
           <w:sz w:val="19"/>
         </w:rPr>
-        <w:t xml:space="preserve"> (60), and everything from steps 4, 6 and 8.</w:t>
+        <w:t xml:space="preserve">, then </w:t>
+      </w:r>
+      <w:r>
+        <w:rPr>
+          <w:rFonts w:ascii="Consolas" w:hAnsi="Consolas"/>
+          <w:color w:val="18202B"/>
+          <w:sz w:val="17"/>
+        </w:rPr>
+        <w:t>Kafka producer has its OAuth token for SASL after … ms</w:t>
       </w:r>
     </w:p>
     <w:p>
       <w:pPr>
-        <w:spacing w:before="40" w:after="20"/>
-        <w:ind w:left="113"/>
-      </w:pPr>
-      <w:r>
-        <w:rPr>
-          <w:b/>
-          <w:color w:val="5A6575"/>
-          <w:sz w:val="16"/>
-        </w:rPr>
-        <w:t xml:space="preserve">GETS BACK   </w:t>
-      </w:r>
-      <w:r>
-        <w:rPr>
-          <w:b w:val="0"/>
-          <w:color w:val="18202B"/>
-          <w:sz w:val="19"/>
-        </w:rPr>
-        <w:t>On success, the topic's partitions and their leader brokers. On failure, librdkafka's reason for each broker, which the next run attaches to the error.</w:t>
-      </w:r>
-    </w:p>
-    <w:p>
-      <w:pPr>
-        <w:spacing w:before="80" w:after="80"/>
-      </w:pPr>
-      <w:r>
-        <w:rPr>
-          <w:b w:val="0"/>
-          <w:color w:val="B42318"/>
-          <w:sz w:val="19"/>
-        </w:rPr>
-        <w:t xml:space="preserve">Failed after ~10 s (the old timeout) with </w:t>
-      </w:r>
-      <w:r>
-        <w:rPr>
-          <w:rFonts w:ascii="Consolas" w:hAnsi="Consolas"/>
-          <w:color w:val="B42318"/>
-          <w:sz w:val="17"/>
-        </w:rPr>
-        <w:t>Local: Broker transport failure</w:t>
-      </w:r>
-      <w:r>
-        <w:rPr>
-          <w:b w:val="0"/>
-          <w:color w:val="B42318"/>
-          <w:sz w:val="19"/>
-        </w:rPr>
-        <w:t>. The run stops here with exit code 32.</w:t>
-      </w:r>
-    </w:p>
-    <w:p>
-      <w:pPr>
-        <w:spacing w:before="280" w:after="80"/>
-        <w:shd w:val="clear" w:color="auto" w:fill="EEF0F3"/>
-      </w:pPr>
-      <w:r>
-        <w:rPr>
-          <w:b/>
-          <w:color w:val="5A6575"/>
-          <w:sz w:val="17"/>
-          <w:spacing w:val="15"/>
-        </w:rPr>
-        <w:t xml:space="preserve">   NOT REACHED: WHAT HAS TO HAPPEN AFTER STEP 11</w:t>
-      </w:r>
-    </w:p>
-    <w:p>
-      <w:pPr>
         <w:pStyle w:val="Heading2"/>
       </w:pPr>
       <w:r>
         <w:rPr>
           <w:color w:val="6B7380"/>
         </w:rPr>
-        <w:t>12.  Assemble the publisher and Avro serializer</w:t>
+        <w:t>12.  Topic metadata check (list_topics)</w:t>
       </w:r>
       <w:r>
         <w:rPr>
@@ -3429,7 +3352,7 @@
           <w:sz w:val="17"/>
           <w:spacing w:val="15"/>
         </w:rPr>
-        <w:t xml:space="preserve">   NOT REACHED</w:t>
+        <w:t xml:space="preserve">   OFF</w:t>
       </w:r>
     </w:p>
     <w:p>
@@ -3442,7 +3365,7 @@
           <w:color w:val="5A6575"/>
           <w:sz w:val="21"/>
         </w:rPr>
-        <w:t xml:space="preserve">Builds the serializer that puts the 5-byte Confluent header in front of every record: magic byte </w:t>
+        <w:t>The step that failed on 6 October. It is now off by default (</w:t>
       </w:r>
       <w:r>
         <w:rPr>
@@ -3450,7 +3373,7 @@
           <w:color w:val="5A6575"/>
           <w:sz w:val="19"/>
         </w:rPr>
-        <w:t>00</w:t>
+        <w:t>resilience.preflight_metadata_enabled: false</w:t>
       </w:r>
       <w:r>
         <w:rPr>
@@ -3458,7 +3381,7 @@
           <w:color w:val="5A6575"/>
           <w:sz w:val="21"/>
         </w:rPr>
-        <w:t xml:space="preserve"> and the schema ID 3665 as </w:t>
+        <w:t xml:space="preserve">), and librdkafka fetches the topic metadata itself at the first publish (step 16). Turn it on with </w:t>
       </w:r>
       <w:r>
         <w:rPr>
@@ -3466,7 +3389,7 @@
           <w:color w:val="5A6575"/>
           <w:sz w:val="19"/>
         </w:rPr>
-        <w:t>00 00 0E 51</w:t>
+        <w:t>IFC_RESILIENCE__PREFLIGHT_METADATA_ENABLED=true</w:t>
       </w:r>
       <w:r>
         <w:rPr>
@@ -3474,7 +3397,7 @@
           <w:color w:val="5A6575"/>
           <w:sz w:val="21"/>
         </w:rPr>
-        <w:t>.</w:t>
+        <w:t xml:space="preserve"> to fail fast, with librdkafka's per-broker reasons, before any row is read.</w:t>
       </w:r>
     </w:p>
     <w:p>
@@ -3487,27 +3410,64 @@
           <w:color w:val="5A6575"/>
           <w:sz w:val="16"/>
         </w:rPr>
-        <w:t>utility/kafka_factory.py:550–559 · build_serializer</w:t>
+        <w:t>utility/kafka_factory.py:586 → _metadata_checks (:484) → producer.list_topics (:489)</w:t>
       </w:r>
     </w:p>
     <w:p>
       <w:pPr>
+        <w:spacing w:before="80" w:after="80"/>
+      </w:pPr>
+      <w:r>
+        <w:rPr>
+          <w:b w:val="0"/>
+          <w:color w:val="18202B"/>
+          <w:sz w:val="19"/>
+        </w:rPr>
+        <w:t xml:space="preserve">On 6 October it ran before any poll, so no broker had a token. It failed after 60 s with </w:t>
+      </w:r>
+      <w:r>
+        <w:rPr>
+          <w:rFonts w:ascii="Consolas" w:hAnsi="Consolas"/>
+          <w:color w:val="18202B"/>
+          <w:sz w:val="17"/>
+        </w:rPr>
+        <w:t>Local: Broker transport failure</w:t>
+      </w:r>
+      <w:r>
+        <w:rPr>
+          <w:b w:val="0"/>
+          <w:color w:val="18202B"/>
+          <w:sz w:val="19"/>
+        </w:rPr>
+        <w:t xml:space="preserve">, exit 32. Log now: </w:t>
+      </w:r>
+      <w:r>
+        <w:rPr>
+          <w:rFonts w:ascii="Consolas" w:hAnsi="Consolas"/>
+          <w:color w:val="18202B"/>
+          <w:sz w:val="17"/>
+        </w:rPr>
+        <w:t>Topic metadata preflight is off; the first publish brings up the broker connection</w:t>
+      </w:r>
+    </w:p>
+    <w:p>
+      <w:pPr>
         <w:pStyle w:val="Heading2"/>
       </w:pPr>
       <w:r>
         <w:rPr>
-          <w:color w:val="6B7380"/>
-        </w:rPr>
-        <w:t>13.  Read the trigger rows</w:t>
+          <w:color w:val="18202B"/>
+        </w:rPr>
+        <w:t>13.  Assemble the publisher and Avro serializer</w:t>
       </w:r>
       <w:r>
         <w:rPr>
           <w:b/>
-          <w:color w:val="6B7380"/>
+          <w:color w:val="1D7A4A"/>
           <w:sz w:val="17"/>
           <w:spacing w:val="15"/>
         </w:rPr>
-        <w:t xml:space="preserve">   NOT REACHED</w:t>
+        <w:t xml:space="preserve">   PASSED</w:t>
       </w:r>
     </w:p>
     <w:p>
@@ -3517,10 +3477,42 @@
       <w:r>
         <w:rPr>
           <w:b w:val="0"/>
-          <w:color w:val="5A6575"/>
+          <w:color w:val="18202B"/>
           <w:sz w:val="21"/>
         </w:rPr>
-        <w:t>Reads the run month's rows. The business date is the last day of the month.</w:t>
+        <w:t xml:space="preserve">Builds the serializer that puts the 5-byte Confluent header in front of every record: magic byte </w:t>
+      </w:r>
+      <w:r>
+        <w:rPr>
+          <w:rFonts w:ascii="Consolas" w:hAnsi="Consolas"/>
+          <w:color w:val="18202B"/>
+          <w:sz w:val="19"/>
+        </w:rPr>
+        <w:t>00</w:t>
+      </w:r>
+      <w:r>
+        <w:rPr>
+          <w:b w:val="0"/>
+          <w:color w:val="18202B"/>
+          <w:sz w:val="21"/>
+        </w:rPr>
+        <w:t xml:space="preserve"> and the schema ID 3665 as </w:t>
+      </w:r>
+      <w:r>
+        <w:rPr>
+          <w:rFonts w:ascii="Consolas" w:hAnsi="Consolas"/>
+          <w:color w:val="18202B"/>
+          <w:sz w:val="19"/>
+        </w:rPr>
+        <w:t>00 00 0E 51</w:t>
+      </w:r>
+      <w:r>
+        <w:rPr>
+          <w:b w:val="0"/>
+          <w:color w:val="18202B"/>
+          <w:sz w:val="21"/>
+        </w:rPr>
+        <w:t>.</w:t>
       </w:r>
     </w:p>
     <w:p>
@@ -3533,36 +3525,82 @@
           <w:color w:val="5A6575"/>
           <w:sz w:val="16"/>
         </w:rPr>
-        <w:t>utility/connector_runner.py:389 · run_batch → utility/trigger_source.py:114</w:t>
+        <w:t>utility/kafka_factory.py:596–605 · build_serializer</w:t>
       </w:r>
     </w:p>
     <w:p>
       <w:pPr>
-        <w:keepNext/>
-        <w:spacing w:before="80" w:after="40"/>
-      </w:pPr>
+        <w:pStyle w:val="Heading2"/>
+      </w:pPr>
+      <w:r>
+        <w:rPr>
+          <w:color w:val="18202B"/>
+        </w:rPr>
+        <w:t>14.  Read the trigger rows</w:t>
+      </w:r>
       <w:r>
         <w:rPr>
           <w:b/>
-          <w:sz w:val="19"/>
-        </w:rPr>
-        <w:t>Sends to Amazon Athena</w:t>
-      </w:r>
+          <w:color w:val="1D7A4A"/>
+          <w:sz w:val="17"/>
+          <w:spacing w:val="15"/>
+        </w:rPr>
+        <w:t xml:space="preserve">   PASSED</w:t>
+      </w:r>
+    </w:p>
+    <w:p>
+      <w:pPr>
+        <w:spacing w:before="0" w:after="40"/>
+      </w:pPr>
+      <w:r>
+        <w:rPr>
+          <w:b w:val="0"/>
+          <w:color w:val="18202B"/>
+          <w:sz w:val="21"/>
+        </w:rPr>
+        <w:t>Reads the run month's rows. The business date is the last day of the month.</w:t>
+      </w:r>
+    </w:p>
+    <w:p>
+      <w:pPr>
+        <w:spacing w:before="0" w:after="80"/>
+      </w:pPr>
       <w:r>
         <w:rPr>
           <w:rFonts w:ascii="Consolas" w:hAnsi="Consolas"/>
           <w:color w:val="5A6575"/>
           <w:sz w:val="16"/>
         </w:rPr>
-        <w:t xml:space="preserve">   boto3 · StartQueryExecution → GetQueryResults (paged)</w:t>
+        <w:t>utility/connector_runner.py:398 · run_batch → utility/trigger_source.py:114</w:t>
       </w:r>
     </w:p>
     <w:p>
       <w:pPr>
+        <w:keepNext/>
+        <w:spacing w:before="80" w:after="40"/>
+      </w:pPr>
+      <w:r>
+        <w:rPr>
+          <w:b/>
+          <w:sz w:val="19"/>
+        </w:rPr>
+        <w:t>Sends to Amazon Athena</w:t>
+      </w:r>
+      <w:r>
+        <w:rPr>
+          <w:rFonts w:ascii="Consolas" w:hAnsi="Consolas"/>
+          <w:color w:val="5A6575"/>
+          <w:sz w:val="16"/>
+        </w:rPr>
+        <w:t xml:space="preserve">   boto3 · StartQueryExecution → GetQueryResults (paged)</w:t>
+      </w:r>
+    </w:p>
+    <w:p>
+      <w:pPr>
+        <w:keepNext/>
         <w:spacing w:before="0" w:after="0" w:line="240" w:lineRule="auto"/>
         <w:ind w:left="113"/>
         <w:shd w:val="clear" w:color="auto" w:fill="EEF1F5"/>
-        <w:keepNext/>
         <w:pBdr>
           <w:top w:val="single" w:sz="4" w:space="3" w:color="DDE2E9"/>
         </w:pBdr>
@@ -3578,9 +3616,9 @@
     </w:p>
     <w:p>
       <w:pPr>
+        <w:keepNext/>
         <w:spacing w:before="0" w:after="0" w:line="240" w:lineRule="auto"/>
         <w:ind w:left="113"/>
-        <w:keepNext/>
         <w:shd w:val="clear" w:color="auto" w:fill="EEF1F5"/>
       </w:pPr>
       <w:r>
@@ -3594,9 +3632,9 @@
     </w:p>
     <w:p>
       <w:pPr>
+        <w:keepNext/>
         <w:spacing w:before="0" w:after="0" w:line="240" w:lineRule="auto"/>
         <w:ind w:left="113"/>
-        <w:keepNext/>
         <w:shd w:val="clear" w:color="auto" w:fill="EEF1F5"/>
       </w:pPr>
       <w:r>
@@ -3610,9 +3648,9 @@
     </w:p>
     <w:p>
       <w:pPr>
+        <w:keepNext/>
         <w:spacing w:before="0" w:after="0" w:line="240" w:lineRule="auto"/>
         <w:ind w:left="113"/>
-        <w:keepNext/>
         <w:shd w:val="clear" w:color="auto" w:fill="EEF1F5"/>
       </w:pPr>
       <w:r>
@@ -3626,9 +3664,9 @@
     </w:p>
     <w:p>
       <w:pPr>
+        <w:keepNext/>
         <w:spacing w:before="0" w:after="0" w:line="240" w:lineRule="auto"/>
         <w:ind w:left="113"/>
-        <w:keepNext/>
         <w:shd w:val="clear" w:color="auto" w:fill="EEF1F5"/>
       </w:pPr>
       <w:r>
@@ -3642,9 +3680,9 @@
     </w:p>
     <w:p>
       <w:pPr>
+        <w:keepNext/>
         <w:spacing w:before="0" w:after="0" w:line="240" w:lineRule="auto"/>
         <w:ind w:left="113"/>
-        <w:keepNext/>
         <w:shd w:val="clear" w:color="auto" w:fill="EEF1F5"/>
       </w:pPr>
       <w:r>
@@ -3658,10 +3696,10 @@
     </w:p>
     <w:p>
       <w:pPr>
+        <w:keepNext w:val="0"/>
         <w:spacing w:before="0" w:after="0" w:line="240" w:lineRule="auto"/>
         <w:ind w:left="113"/>
         <w:shd w:val="clear" w:color="auto" w:fill="EEF1F5"/>
-        <w:keepNext w:val="0"/>
         <w:pBdr>
           <w:bottom w:val="single" w:sz="4" w:space="3" w:color="DDE2E9"/>
         </w:pBdr>
@@ -3681,18 +3719,18 @@
       </w:pPr>
       <w:r>
         <w:rPr>
-          <w:color w:val="6B7380"/>
-        </w:rPr>
-        <w:t>14.  Build, serialise and size-check each record</w:t>
+          <w:color w:val="18202B"/>
+        </w:rPr>
+        <w:t>15.  Build, serialise and size-check each record</w:t>
       </w:r>
       <w:r>
         <w:rPr>
           <w:b/>
-          <w:color w:val="6B7380"/>
+          <w:color w:val="1D7A4A"/>
           <w:sz w:val="17"/>
           <w:spacing w:val="15"/>
         </w:rPr>
-        <w:t xml:space="preserve">   NOT REACHED</w:t>
+        <w:t xml:space="preserve">   PASSED</w:t>
       </w:r>
     </w:p>
     <w:p>
@@ -3702,10 +3740,10 @@
       <w:r>
         <w:rPr>
           <w:b w:val="0"/>
-          <w:color w:val="5A6575"/>
+          <w:color w:val="18202B"/>
           <w:sz w:val="21"/>
         </w:rPr>
-        <w:t>Builds the trigger envelope, encodes it with the registered schema, and rejects anything over the 800 KB broker limit before it is sent. This step is local, so nothing is sent.</w:t>
+        <w:t>Builds the trigger envelope, encodes it with the registered schema, and rejects anything over the 800 KB broker limit. Local only, so nothing is sent.</w:t>
       </w:r>
     </w:p>
     <w:p>
@@ -3718,7 +3756,7 @@
           <w:color w:val="5A6575"/>
           <w:sz w:val="16"/>
         </w:rPr>
-        <w:t>utility/connector_runner.py:252 · _publish_record</w:t>
+        <w:t>utility/connector_runner.py:261 · _publish_record</w:t>
       </w:r>
     </w:p>
     <w:p>
@@ -3727,18 +3765,18 @@
       </w:pPr>
       <w:r>
         <w:rPr>
-          <w:color w:val="6B7380"/>
-        </w:rPr>
-        <w:t>15.  Publish with retry</w:t>
+          <w:color w:val="18202B"/>
+        </w:rPr>
+        <w:t>16.  Publish: connect, authenticate, fetch metadata, produce</w:t>
       </w:r>
       <w:r>
         <w:rPr>
           <w:b/>
-          <w:color w:val="6B7380"/>
+          <w:color w:val="1D7A4A"/>
           <w:sz w:val="17"/>
           <w:spacing w:val="15"/>
         </w:rPr>
-        <w:t xml:space="preserve">   NOT REACHED</w:t>
+        <w:t xml:space="preserve">   PASSED</w:t>
       </w:r>
     </w:p>
     <w:p>
@@ -3748,10 +3786,42 @@
       <w:r>
         <w:rPr>
           <w:b w:val="0"/>
-          <w:color w:val="5A6575"/>
+          <w:color w:val="18202B"/>
           <w:sz w:val="21"/>
         </w:rPr>
-        <w:t>Sends each record. Transient failures are retried, and a circuit breaker stops the batch if the brokers stay down.</w:t>
+        <w:t xml:space="preserve">The first </w:t>
+      </w:r>
+      <w:r>
+        <w:rPr>
+          <w:rFonts w:ascii="Consolas" w:hAnsi="Consolas"/>
+          <w:color w:val="18202B"/>
+          <w:sz w:val="19"/>
+        </w:rPr>
+        <w:t>produce()</w:t>
+      </w:r>
+      <w:r>
+        <w:rPr>
+          <w:b w:val="0"/>
+          <w:color w:val="18202B"/>
+          <w:sz w:val="21"/>
+        </w:rPr>
+        <w:t xml:space="preserve"> and </w:t>
+      </w:r>
+      <w:r>
+        <w:rPr>
+          <w:rFonts w:ascii="Consolas" w:hAnsi="Consolas"/>
+          <w:color w:val="18202B"/>
+          <w:sz w:val="19"/>
+        </w:rPr>
+        <w:t>poll(0)</w:t>
+      </w:r>
+      <w:r>
+        <w:rPr>
+          <w:b w:val="0"/>
+          <w:color w:val="18202B"/>
+          <w:sz w:val="21"/>
+        </w:rPr>
+        <w:t xml:space="preserve"> bring the broker connection up. librdkafka does the handshake and the metadata request itself, as it does for produce_app, then sends each record to its partition's leader.</w:t>
       </w:r>
     </w:p>
     <w:p>
@@ -3764,7 +3834,7 @@
           <w:color w:val="5A6575"/>
           <w:sz w:val="16"/>
         </w:rPr>
-        <w:t>utility/connector_runner.py:287 · _publish_with_retry → utility/kafka_publisher.py:206 · produce</w:t>
+        <w:t>utility/connector_runner.py:296 · _publish_with_retry → utility/kafka_publisher.py:206 produce, :214 poll(0)</w:t>
       </w:r>
     </w:p>
     <w:p>
@@ -3777,7 +3847,7 @@
           <w:b/>
           <w:sz w:val="19"/>
         </w:rPr>
-        <w:t>Sends to Kafka broker (partition leader)</w:t>
+        <w:t>Sends to Kafka broker, port 9095</w:t>
       </w:r>
       <w:r>
         <w:rPr>
@@ -3785,15 +3855,15 @@
           <w:color w:val="5A6575"/>
           <w:sz w:val="16"/>
         </w:rPr>
-        <w:t xml:space="preserve">   librdkafka · ProduceRequest on the step 11 connection</w:t>
+        <w:t xml:space="preserve">   librdkafka · Kafka protocol over SASL_SSL</w:t>
       </w:r>
     </w:p>
     <w:p>
       <w:pPr>
+        <w:keepNext/>
         <w:spacing w:before="0" w:after="0" w:line="240" w:lineRule="auto"/>
         <w:ind w:left="113"/>
         <w:shd w:val="clear" w:color="auto" w:fill="EEF1F5"/>
-        <w:keepNext/>
         <w:pBdr>
           <w:top w:val="single" w:sz="4" w:space="3" w:color="DDE2E9"/>
         </w:pBdr>
@@ -3801,17 +3871,145 @@
       <w:r>
         <w:rPr>
           <w:rFonts w:ascii="Consolas" w:hAnsi="Consolas"/>
-          <w:color w:val="18202B"/>
+          <w:color w:val="5A6575"/>
           <w:sz w:val="16"/>
         </w:rPr>
-        <w:t>topic   = tc01_fncmtrgrbb_ifc_tbb_kyc_refresh</w:t>
+        <w:t># 1. TCP connect              -&gt; ldndsr000009480.intranet.barcapint.com:9095 (any bootstrap broker)</w:t>
       </w:r>
     </w:p>
     <w:p>
       <w:pPr>
+        <w:keepNext/>
         <w:spacing w:before="0" w:after="0" w:line="240" w:lineRule="auto"/>
         <w:ind w:left="113"/>
+        <w:shd w:val="clear" w:color="auto" w:fill="EEF1F5"/>
+      </w:pPr>
+      <w:r>
+        <w:rPr>
+          <w:rFonts w:ascii="Consolas" w:hAnsi="Consolas"/>
+          <w:color w:val="5A6575"/>
+          <w:sz w:val="16"/>
+        </w:rPr>
+        <w:t># 2. TLS handshake (SNI)      -&gt; broker certificate checked against /tmp/ifc-certs/CARoot.pem,</w:t>
+      </w:r>
+    </w:p>
+    <w:p>
+      <w:pPr>
         <w:keepNext/>
+        <w:spacing w:before="0" w:after="0" w:line="240" w:lineRule="auto"/>
+        <w:ind w:left="113"/>
+        <w:shd w:val="clear" w:color="auto" w:fill="EEF1F5"/>
+      </w:pPr>
+      <w:r>
+        <w:rPr>
+          <w:rFonts w:ascii="Consolas" w:hAnsi="Consolas"/>
+          <w:color w:val="5A6575"/>
+          <w:sz w:val="16"/>
+        </w:rPr>
+        <w:t>#                                chain: TEST BARCLAYS INTERNAL Root CA G1</w:t>
+      </w:r>
+    </w:p>
+    <w:p>
+      <w:pPr>
+        <w:keepNext/>
+        <w:spacing w:before="0" w:after="0" w:line="240" w:lineRule="auto"/>
+        <w:ind w:left="113"/>
+        <w:shd w:val="clear" w:color="auto" w:fill="EEF1F5"/>
+      </w:pPr>
+      <w:r>
+        <w:rPr>
+          <w:rFonts w:ascii="Consolas" w:hAnsi="Consolas"/>
+          <w:color w:val="5A6575"/>
+          <w:sz w:val="16"/>
+        </w:rPr>
+        <w:t># 3. ApiVersionsRequest       -&gt; which protocol versions the broker speaks</w:t>
+      </w:r>
+    </w:p>
+    <w:p>
+      <w:pPr>
+        <w:keepNext/>
+        <w:spacing w:before="0" w:after="0" w:line="240" w:lineRule="auto"/>
+        <w:ind w:left="113"/>
+        <w:shd w:val="clear" w:color="auto" w:fill="EEF1F5"/>
+      </w:pPr>
+      <w:r>
+        <w:rPr>
+          <w:rFonts w:ascii="Consolas" w:hAnsi="Consolas"/>
+          <w:color w:val="5A6575"/>
+          <w:sz w:val="16"/>
+        </w:rPr>
+        <w:t># 4. SaslHandshakeRequest     -&gt; mechanism = OAUTHBEARER</w:t>
+      </w:r>
+    </w:p>
+    <w:p>
+      <w:pPr>
+        <w:keepNext/>
+        <w:spacing w:before="0" w:after="0" w:line="240" w:lineRule="auto"/>
+        <w:ind w:left="113"/>
+        <w:shd w:val="clear" w:color="auto" w:fill="EEF1F5"/>
+      </w:pPr>
+      <w:r>
+        <w:rPr>
+          <w:rFonts w:ascii="Consolas" w:hAnsi="Consolas"/>
+          <w:color w:val="5A6575"/>
+          <w:sz w:val="16"/>
+        </w:rPr>
+        <w:t># 5. SaslAuthenticateRequest  -&gt; "n,,\x01auth=Bearer &lt;BAM JWT from step 11&gt;\x01\x01"</w:t>
+      </w:r>
+    </w:p>
+    <w:p>
+      <w:pPr>
+        <w:keepNext/>
+        <w:spacing w:before="0" w:after="0" w:line="240" w:lineRule="auto"/>
+        <w:ind w:left="113"/>
+        <w:shd w:val="clear" w:color="auto" w:fill="EEF1F5"/>
+      </w:pPr>
+      <w:r>
+        <w:rPr>
+          <w:rFonts w:ascii="Consolas" w:hAnsi="Consolas"/>
+          <w:color w:val="5A6575"/>
+          <w:sz w:val="16"/>
+        </w:rPr>
+        <w:t># 6. MetadataRequest          -&gt; partitions and leaders of tc01_fncmtrgrbb_ifc_tbb_kyc_refresh</w:t>
+      </w:r>
+    </w:p>
+    <w:p>
+      <w:pPr>
+        <w:keepNext/>
+        <w:spacing w:before="0" w:after="0" w:line="240" w:lineRule="auto"/>
+        <w:ind w:left="113"/>
+        <w:shd w:val="clear" w:color="auto" w:fill="EEF1F5"/>
+      </w:pPr>
+      <w:r>
+        <w:rPr>
+          <w:rFonts w:ascii="Consolas" w:hAnsi="Consolas"/>
+          <w:color w:val="5A6575"/>
+          <w:sz w:val="16"/>
+        </w:rPr>
+        <w:t># 7. InitProducerIdRequest    -&gt; producer ID for idempotence</w:t>
+      </w:r>
+    </w:p>
+    <w:p>
+      <w:pPr>
+        <w:keepNext/>
+        <w:spacing w:before="0" w:after="0" w:line="240" w:lineRule="auto"/>
+        <w:ind w:left="113"/>
+        <w:shd w:val="clear" w:color="auto" w:fill="EEF1F5"/>
+      </w:pPr>
+      <w:r>
+        <w:rPr>
+          <w:rFonts w:ascii="Consolas" w:hAnsi="Consolas"/>
+          <w:color w:val="5A6575"/>
+          <w:sz w:val="16"/>
+        </w:rPr>
+        <w:t># 8. ProduceRequest to each partition leader:</w:t>
+      </w:r>
+    </w:p>
+    <w:p>
+      <w:pPr>
+        <w:keepNext/>
+        <w:spacing w:before="0" w:after="0" w:line="240" w:lineRule="auto"/>
+        <w:ind w:left="113"/>
         <w:shd w:val="clear" w:color="auto" w:fill="EEF1F5"/>
       </w:pPr>
       <w:r>
@@ -3820,14 +4018,14 @@
           <w:color w:val="18202B"/>
           <w:sz w:val="16"/>
         </w:rPr>
-        <w:t>key     = &lt;trigger_id&gt;                         # UTF-8, unique per record</w:t>
+        <w:t>topic   = tc01_fncmtrgrbb_ifc_tbb_kyc_refresh</w:t>
       </w:r>
     </w:p>
     <w:p>
       <w:pPr>
+        <w:keepNext/>
         <w:spacing w:before="0" w:after="0" w:line="240" w:lineRule="auto"/>
         <w:ind w:left="113"/>
-        <w:keepNext/>
         <w:shd w:val="clear" w:color="auto" w:fill="EEF1F5"/>
       </w:pPr>
       <w:r>
@@ -3836,14 +4034,14 @@
           <w:color w:val="18202B"/>
           <w:sz w:val="16"/>
         </w:rPr>
-        <w:t>value   = 00 | 00 00 0E 51 | &lt;Avro record&gt;     # magic byte | schema id 3665 | body</w:t>
+        <w:t>key     = &lt;trigger_id&gt;                         # UTF-8, unique per record</w:t>
       </w:r>
     </w:p>
     <w:p>
       <w:pPr>
+        <w:keepNext/>
         <w:spacing w:before="0" w:after="0" w:line="240" w:lineRule="auto"/>
         <w:ind w:left="113"/>
-        <w:keepNext/>
         <w:shd w:val="clear" w:color="auto" w:fill="EEF1F5"/>
       </w:pPr>
       <w:r>
@@ -3852,15 +4050,47 @@
           <w:color w:val="18202B"/>
           <w:sz w:val="16"/>
         </w:rPr>
-        <w:t>headers = none</w:t>
+        <w:t>value   = 00 | 00 00 0E 51 | &lt;Avro record&gt;     # magic byte | schema id 3665 | body</w:t>
       </w:r>
     </w:p>
     <w:p>
       <w:pPr>
+        <w:keepNext/>
         <w:spacing w:before="0" w:after="0" w:line="240" w:lineRule="auto"/>
         <w:ind w:left="113"/>
         <w:shd w:val="clear" w:color="auto" w:fill="EEF1F5"/>
+      </w:pPr>
+      <w:r>
+        <w:rPr>
+          <w:rFonts w:ascii="Consolas" w:hAnsi="Consolas"/>
+          <w:color w:val="5A6575"/>
+          <w:sz w:val="16"/>
+        </w:rPr>
+        <w:t>#   triggerOriginatingSystem = idSystem = SNSVC0084378 (SIT; envelope.originating_systems)</w:t>
+      </w:r>
+    </w:p>
+    <w:p>
+      <w:pPr>
+        <w:keepNext/>
+        <w:spacing w:before="0" w:after="0" w:line="240" w:lineRule="auto"/>
+        <w:ind w:left="113"/>
+        <w:shd w:val="clear" w:color="auto" w:fill="EEF1F5"/>
+      </w:pPr>
+      <w:r>
+        <w:rPr>
+          <w:rFonts w:ascii="Consolas" w:hAnsi="Consolas"/>
+          <w:color w:val="18202B"/>
+          <w:sz w:val="16"/>
+        </w:rPr>
+        <w:t>headers = none</w:t>
+      </w:r>
+    </w:p>
+    <w:p>
+      <w:pPr>
         <w:keepNext w:val="0"/>
+        <w:spacing w:before="0" w:after="0" w:line="240" w:lineRule="auto"/>
+        <w:ind w:left="113"/>
+        <w:shd w:val="clear" w:color="auto" w:fill="EEF1F5"/>
         <w:pBdr>
           <w:bottom w:val="single" w:sz="4" w:space="3" w:color="DDE2E9"/>
         </w:pBdr>
@@ -3876,22 +4106,89 @@
     </w:p>
     <w:p>
       <w:pPr>
+        <w:spacing w:before="40" w:after="20"/>
+        <w:ind w:left="113"/>
+      </w:pPr>
+      <w:r>
+        <w:rPr>
+          <w:b/>
+          <w:color w:val="5A6575"/>
+          <w:sz w:val="16"/>
+        </w:rPr>
+        <w:t xml:space="preserve">GETS BACK   </w:t>
+      </w:r>
+      <w:r>
+        <w:rPr>
+          <w:b w:val="0"/>
+          <w:color w:val="18202B"/>
+          <w:sz w:val="19"/>
+        </w:rPr>
+        <w:t xml:space="preserve">A ProduceResponse per batch: partition and offset, or the error for that record (for example </w:t>
+      </w:r>
+      <w:r>
+        <w:rPr>
+          <w:rFonts w:ascii="Consolas" w:hAnsi="Consolas"/>
+          <w:color w:val="18202B"/>
+          <w:sz w:val="17"/>
+        </w:rPr>
+        <w:t>UNKNOWN_TOPIC_OR_PART</w:t>
+      </w:r>
+      <w:r>
+        <w:rPr>
+          <w:b w:val="0"/>
+          <w:color w:val="18202B"/>
+          <w:sz w:val="19"/>
+        </w:rPr>
+        <w:t xml:space="preserve">, </w:t>
+      </w:r>
+      <w:r>
+        <w:rPr>
+          <w:rFonts w:ascii="Consolas" w:hAnsi="Consolas"/>
+          <w:color w:val="18202B"/>
+          <w:sz w:val="17"/>
+        </w:rPr>
+        <w:t>TOPIC_AUTHORIZATION_FAILED</w:t>
+      </w:r>
+      <w:r>
+        <w:rPr>
+          <w:b w:val="0"/>
+          <w:color w:val="18202B"/>
+          <w:sz w:val="19"/>
+        </w:rPr>
+        <w:t>).</w:t>
+      </w:r>
+    </w:p>
+    <w:p>
+      <w:pPr>
+        <w:spacing w:before="80" w:after="80"/>
+      </w:pPr>
+      <w:r>
+        <w:rPr>
+          <w:b w:val="0"/>
+          <w:color w:val="18202B"/>
+          <w:sz w:val="19"/>
+        </w:rPr>
+        <w:t>7 October run: records delivered to the topic.</w:t>
+      </w:r>
+    </w:p>
+    <w:p>
+      <w:pPr>
         <w:pStyle w:val="Heading2"/>
       </w:pPr>
       <w:r>
         <w:rPr>
-          <w:color w:val="6B7380"/>
-        </w:rPr>
-        <w:t>16.  Flush and wait for acknowledgements</w:t>
+          <w:color w:val="18202B"/>
+        </w:rPr>
+        <w:t>17.  Flush and wait for acknowledgements</w:t>
       </w:r>
       <w:r>
         <w:rPr>
           <w:b/>
-          <w:color w:val="6B7380"/>
+          <w:color w:val="1D7A4A"/>
           <w:sz w:val="17"/>
           <w:spacing w:val="15"/>
         </w:rPr>
-        <w:t xml:space="preserve">   NOT REACHED</w:t>
+        <w:t xml:space="preserve">   PASSED</w:t>
       </w:r>
     </w:p>
     <w:p>
@@ -3901,7 +4198,7 @@
       <w:r>
         <w:rPr>
           <w:b w:val="0"/>
-          <w:color w:val="5A6575"/>
+          <w:color w:val="18202B"/>
           <w:sz w:val="21"/>
         </w:rPr>
         <w:t xml:space="preserve">Waits up to </w:t>
@@ -3909,7 +4206,7 @@
       <w:r>
         <w:rPr>
           <w:rFonts w:ascii="Consolas" w:hAnsi="Consolas"/>
-          <w:color w:val="5A6575"/>
+          <w:color w:val="18202B"/>
           <w:sz w:val="19"/>
         </w:rPr>
         <w:t>kafka.flush_timeout_seconds</w:t>
@@ -3917,7 +4214,7 @@
       <w:r>
         <w:rPr>
           <w:b w:val="0"/>
-          <w:color w:val="5A6575"/>
+          <w:color w:val="18202B"/>
           <w:sz w:val="21"/>
         </w:rPr>
         <w:t xml:space="preserve"> (120) for a ProduceResponse for every queued record.</w:t>
@@ -3933,7 +4230,7 @@
           <w:color w:val="5A6575"/>
           <w:sz w:val="16"/>
         </w:rPr>
-        <w:t>utility/connector_runner.py:447, :523 · _drain</w:t>
+        <w:t>utility/connector_runner.py:456, :532 · _drain</w:t>
       </w:r>
     </w:p>
     <w:p>
@@ -3942,18 +4239,18 @@
       </w:pPr>
       <w:r>
         <w:rPr>
-          <w:color w:val="6B7380"/>
-        </w:rPr>
-        <w:t>17.  Reconcile, write the manifest and the run marker</w:t>
+          <w:color w:val="18202B"/>
+        </w:rPr>
+        <w:t>18.  Reconcile, write the manifest and the run marker</w:t>
       </w:r>
       <w:r>
         <w:rPr>
           <w:b/>
-          <w:color w:val="6B7380"/>
+          <w:color w:val="1D7A4A"/>
           <w:sz w:val="17"/>
           <w:spacing w:val="15"/>
         </w:rPr>
-        <w:t xml:space="preserve">   NOT REACHED</w:t>
+        <w:t xml:space="preserve">   PASSED</w:t>
       </w:r>
     </w:p>
     <w:p>
@@ -3963,7 +4260,7 @@
       <w:r>
         <w:rPr>
           <w:b w:val="0"/>
-          <w:color w:val="5A6575"/>
+          <w:color w:val="18202B"/>
           <w:sz w:val="21"/>
         </w:rPr>
         <w:t>Checks rows read = records published = records acknowledged, then records the outcome.</w:t>
@@ -3979,7 +4276,7 @@
           <w:color w:val="5A6575"/>
           <w:sz w:val="16"/>
         </w:rPr>
-        <w:t>utility/connector_runner.py:453, :555 · scripts/main_ecs.py:514 · utility/run_gate.py:187</w:t>
+        <w:t>utility/connector_runner.py:462, :564 · scripts/main_ecs.py:514 · utility/run_gate.py:187</w:t>
       </w:r>
     </w:p>
     <w:p>
@@ -4005,10 +4302,10 @@
     </w:p>
     <w:p>
       <w:pPr>
+        <w:keepNext/>
         <w:spacing w:before="0" w:after="0" w:line="240" w:lineRule="auto"/>
         <w:ind w:left="113"/>
         <w:shd w:val="clear" w:color="auto" w:fill="EEF1F5"/>
-        <w:keepNext/>
         <w:pBdr>
           <w:top w:val="single" w:sz="4" w:space="3" w:color="DDE2E9"/>
         </w:pBdr>
@@ -4024,9 +4321,9 @@
     </w:p>
     <w:p>
       <w:pPr>
+        <w:keepNext/>
         <w:spacing w:before="0" w:after="0" w:line="240" w:lineRule="auto"/>
         <w:ind w:left="113"/>
-        <w:keepNext/>
         <w:shd w:val="clear" w:color="auto" w:fill="EEF1F5"/>
       </w:pPr>
       <w:r>
@@ -4040,9 +4337,9 @@
     </w:p>
     <w:p>
       <w:pPr>
+        <w:keepNext/>
         <w:spacing w:before="0" w:after="0" w:line="240" w:lineRule="auto"/>
         <w:ind w:left="113"/>
-        <w:keepNext/>
         <w:shd w:val="clear" w:color="auto" w:fill="EEF1F5"/>
       </w:pPr>
       <w:r>
@@ -4056,9 +4353,9 @@
     </w:p>
     <w:p>
       <w:pPr>
+        <w:keepNext/>
         <w:spacing w:before="0" w:after="0" w:line="240" w:lineRule="auto"/>
         <w:ind w:left="113"/>
-        <w:keepNext/>
         <w:shd w:val="clear" w:color="auto" w:fill="EEF1F5"/>
       </w:pPr>
       <w:r>
@@ -4072,9 +4369,9 @@
     </w:p>
     <w:p>
       <w:pPr>
+        <w:keepNext/>
         <w:spacing w:before="0" w:after="0" w:line="240" w:lineRule="auto"/>
         <w:ind w:left="113"/>
-        <w:keepNext/>
         <w:shd w:val="clear" w:color="auto" w:fill="EEF1F5"/>
       </w:pPr>
       <w:r>
@@ -4088,9 +4385,9 @@
     </w:p>
     <w:p>
       <w:pPr>
+        <w:keepNext/>
         <w:spacing w:before="0" w:after="0" w:line="240" w:lineRule="auto"/>
         <w:ind w:left="113"/>
-        <w:keepNext/>
         <w:shd w:val="clear" w:color="auto" w:fill="EEF1F5"/>
       </w:pPr>
       <w:r>
@@ -4104,10 +4401,10 @@
     </w:p>
     <w:p>
       <w:pPr>
+        <w:keepNext w:val="0"/>
         <w:spacing w:before="0" w:after="0" w:line="240" w:lineRule="auto"/>
         <w:ind w:left="113"/>
         <w:shd w:val="clear" w:color="auto" w:fill="EEF1F5"/>
-        <w:keepNext w:val="0"/>
         <w:pBdr>
           <w:bottom w:val="single" w:sz="4" w:space="3" w:color="DDE2E9"/>
         </w:pBdr>
@@ -4126,7 +4423,7 @@
         <w:pStyle w:val="Heading1"/>
       </w:pPr>
       <w:r>
-        <w:t>Why step 11 fails although the network checks pass</w:t>
+        <w:t>What was wrong</w:t>
       </w:r>
     </w:p>
     <w:p>
@@ -4139,12 +4436,27 @@
           <w:color w:val="18202B"/>
           <w:sz w:val="21"/>
         </w:rPr>
-        <w:t>Step 7 opens a TCP socket and closes it. Step 11 has to get through three more hops on the same connection, and the error only says that every broker connection was dropped somewhere along the way.</w:t>
+        <w:t xml:space="preserve">Three problems sat on top of each other. Each fix exposed the next, and every one ended in the same generic error, because </w:t>
+      </w:r>
+      <w:r>
+        <w:rPr>
+          <w:rFonts w:ascii="Consolas" w:hAnsi="Consolas"/>
+          <w:color w:val="18202B"/>
+          <w:sz w:val="19"/>
+        </w:rPr>
+        <w:t>_TRANSPORT</w:t>
+      </w:r>
+      <w:r>
+        <w:rPr>
+          <w:b w:val="0"/>
+          <w:color w:val="18202B"/>
+          <w:sz w:val="21"/>
+        </w:rPr>
+        <w:t xml:space="preserve"> only says that no broker connection got through.</w:t>
       </w:r>
     </w:p>
     <w:tbl>
       <w:tblPr>
-        <w:tblStyle w:val="TableGrid"/>
         <w:tblW w:type="auto" w:w="0"/>
         <w:jc w:val="left"/>
         <w:tblLayout w:type="fixed"/>
@@ -4159,13 +4471,15 @@
         </w:tblBorders>
       </w:tblPr>
       <w:tblGrid>
-        <w:gridCol w:w="4819"/>
-        <w:gridCol w:w="4819"/>
+        <w:gridCol w:w="2409"/>
+        <w:gridCol w:w="2409"/>
+        <w:gridCol w:w="2409"/>
+        <w:gridCol w:w="2409"/>
       </w:tblGrid>
       <w:tr>
         <w:tc>
           <w:tcPr>
-            <w:tcW w:type="dxa" w:w="2381"/>
+            <w:tcW w:type="dxa" w:w="1474"/>
             <w:shd w:val="clear" w:color="auto" w:fill="EEF0F3"/>
           </w:tcPr>
           <w:p>
@@ -4179,13 +4493,13 @@
                 <w:color w:val="5A6575"/>
                 <w:sz w:val="16"/>
               </w:rPr>
-              <w:t>HOP</w:t>
+              <w:t>RUN</w:t>
             </w:r>
           </w:p>
         </w:tc>
         <w:tc>
           <w:tcPr>
-            <w:tcW w:type="dxa" w:w="7257"/>
+            <w:tcW w:type="dxa" w:w="1701"/>
             <w:shd w:val="clear" w:color="auto" w:fill="EEF0F3"/>
           </w:tcPr>
           <w:p>
@@ -4199,7 +4513,47 @@
                 <w:color w:val="5A6575"/>
                 <w:sz w:val="16"/>
               </w:rPr>
-              <w:t>WHAT IT NEEDS</w:t>
+              <w:t>SYMPTOM</w:t>
+            </w:r>
+          </w:p>
+        </w:tc>
+        <w:tc>
+          <w:tcPr>
+            <w:tcW w:type="dxa" w:w="3628"/>
+            <w:shd w:val="clear" w:color="auto" w:fill="EEF0F3"/>
+          </w:tcPr>
+          <w:p>
+            <w:pPr>
+              <w:spacing w:before="40" w:after="40"/>
+            </w:pPr>
+            <w:r/>
+            <w:r>
+              <w:rPr>
+                <w:b/>
+                <w:color w:val="5A6575"/>
+                <w:sz w:val="16"/>
+              </w:rPr>
+              <w:t>CAUSE</w:t>
+            </w:r>
+          </w:p>
+        </w:tc>
+        <w:tc>
+          <w:tcPr>
+            <w:tcW w:type="dxa" w:w="2835"/>
+            <w:shd w:val="clear" w:color="auto" w:fill="EEF0F3"/>
+          </w:tcPr>
+          <w:p>
+            <w:pPr>
+              <w:spacing w:before="40" w:after="40"/>
+            </w:pPr>
+            <w:r/>
+            <w:r>
+              <w:rPr>
+                <w:b/>
+                <w:color w:val="5A6575"/>
+                <w:sz w:val="16"/>
+              </w:rPr>
+              <w:t>FIX</w:t>
             </w:r>
           </w:p>
         </w:tc>
@@ -4207,7 +4561,7 @@
       <w:tr>
         <w:tc>
           <w:tcPr>
-            <w:tcW w:type="dxa" w:w="2381"/>
+            <w:tcW w:type="dxa" w:w="1474"/>
           </w:tcPr>
           <w:p>
             <w:pPr>
@@ -4220,13 +4574,112 @@
                 <w:color w:val="18202B"/>
                 <w:sz w:val="19"/>
               </w:rPr>
-              <w:t>TCP connect</w:t>
+              <w:t>6 Oct, 12:14 UTC</w:t>
             </w:r>
           </w:p>
         </w:tc>
         <w:tc>
           <w:tcPr>
-            <w:tcW w:type="dxa" w:w="7257"/>
+            <w:tcW w:type="dxa" w:w="1701"/>
+          </w:tcPr>
+          <w:p>
+            <w:pPr>
+              <w:spacing w:before="40" w:after="40"/>
+            </w:pPr>
+            <w:r/>
+            <w:r>
+              <w:rPr>
+                <w:rFonts w:ascii="Consolas" w:hAnsi="Consolas"/>
+                <w:color w:val="18202B"/>
+                <w:sz w:val="17"/>
+              </w:rPr>
+              <w:t>_TRANSPORT</w:t>
+            </w:r>
+            <w:r>
+              <w:rPr>
+                <w:b w:val="0"/>
+                <w:color w:val="18202B"/>
+                <w:sz w:val="19"/>
+              </w:rPr>
+              <w:t xml:space="preserve"> after 10 s</w:t>
+            </w:r>
+          </w:p>
+        </w:tc>
+        <w:tc>
+          <w:tcPr>
+            <w:tcW w:type="dxa" w:w="3628"/>
+          </w:tcPr>
+          <w:p>
+            <w:pPr>
+              <w:spacing w:before="40" w:after="40"/>
+            </w:pPr>
+            <w:r/>
+            <w:r>
+              <w:rPr>
+                <w:rFonts w:ascii="Consolas" w:hAnsi="Consolas"/>
+                <w:color w:val="18202B"/>
+                <w:sz w:val="17"/>
+              </w:rPr>
+              <w:t>security.protocol: PLAINTEXT</w:t>
+            </w:r>
+            <w:r>
+              <w:rPr>
+                <w:b w:val="0"/>
+                <w:color w:val="18202B"/>
+                <w:sz w:val="19"/>
+              </w:rPr>
+              <w:t xml:space="preserve"> in the copied DEV config: no TLS, no token</w:t>
+            </w:r>
+          </w:p>
+        </w:tc>
+        <w:tc>
+          <w:tcPr>
+            <w:tcW w:type="dxa" w:w="2835"/>
+          </w:tcPr>
+          <w:p>
+            <w:pPr>
+              <w:spacing w:before="40" w:after="40"/>
+            </w:pPr>
+            <w:r/>
+            <w:r>
+              <w:rPr>
+                <w:rFonts w:ascii="Consolas" w:hAnsi="Consolas"/>
+                <w:color w:val="18202B"/>
+                <w:sz w:val="17"/>
+              </w:rPr>
+              <w:t>SASL_SSL</w:t>
+            </w:r>
+            <w:r>
+              <w:rPr>
+                <w:b w:val="0"/>
+                <w:color w:val="18202B"/>
+                <w:sz w:val="19"/>
+              </w:rPr>
+              <w:t xml:space="preserve"> (</w:t>
+            </w:r>
+            <w:r>
+              <w:rPr>
+                <w:rFonts w:ascii="Consolas" w:hAnsi="Consolas"/>
+                <w:color w:val="18202B"/>
+                <w:sz w:val="17"/>
+              </w:rPr>
+              <w:t>afe1aa3</w:t>
+            </w:r>
+            <w:r>
+              <w:rPr>
+                <w:b w:val="0"/>
+                <w:color w:val="18202B"/>
+                <w:sz w:val="19"/>
+              </w:rPr>
+              <w:t>)</w:t>
+            </w:r>
+          </w:p>
+        </w:tc>
+      </w:tr>
+      <w:tr>
+        <w:tc>
+          <w:tcPr>
+            <w:tcW w:type="dxa" w:w="1474"/>
           </w:tcPr>
           <w:p>
             <w:pPr>
@@ -4239,15 +4692,32 @@
                 <w:color w:val="18202B"/>
                 <w:sz w:val="19"/>
               </w:rPr>
-              <w:t>Proven by step 7.</w:t>
+              <w:t>6 Oct, next run</w:t>
             </w:r>
           </w:p>
         </w:tc>
-      </w:tr>
-      <w:tr>
         <w:tc>
           <w:tcPr>
-            <w:tcW w:type="dxa" w:w="2381"/>
+            <w:tcW w:type="dxa" w:w="1701"/>
+          </w:tcPr>
+          <w:p>
+            <w:pPr>
+              <w:spacing w:before="40" w:after="40"/>
+            </w:pPr>
+            <w:r/>
+            <w:r>
+              <w:rPr>
+                <w:rFonts w:ascii="Consolas" w:hAnsi="Consolas"/>
+                <w:color w:val="18202B"/>
+                <w:sz w:val="17"/>
+              </w:rPr>
+              <w:t>_TRANSPORT</w:t>
+            </w:r>
+          </w:p>
+        </w:tc>
+        <w:tc>
+          <w:tcPr>
+            <w:tcW w:type="dxa" w:w="3628"/>
           </w:tcPr>
           <w:p>
             <w:pPr>
@@ -4260,13 +4730,13 @@
                 <w:color w:val="18202B"/>
                 <w:sz w:val="19"/>
               </w:rPr>
-              <w:t>TLS handshake</w:t>
+              <w:t>Brokers on 9092, the DEV-only plain port, so TLS failed</w:t>
             </w:r>
           </w:p>
         </w:tc>
         <w:tc>
           <w:tcPr>
-            <w:tcW w:type="dxa" w:w="7257"/>
+            <w:tcW w:type="dxa" w:w="2835"/>
           </w:tcPr>
           <w:p>
             <w:pPr>
@@ -4279,7 +4749,23 @@
                 <w:color w:val="18202B"/>
                 <w:sz w:val="19"/>
               </w:rPr>
-              <w:t>A TLS listener port, and a broker certificate the CA bundle trusts.</w:t>
+              <w:t>Port 9095 (</w:t>
+            </w:r>
+            <w:r>
+              <w:rPr>
+                <w:rFonts w:ascii="Consolas" w:hAnsi="Consolas"/>
+                <w:color w:val="18202B"/>
+                <w:sz w:val="17"/>
+              </w:rPr>
+              <w:t>1f35721</w:t>
+            </w:r>
+            <w:r>
+              <w:rPr>
+                <w:b w:val="0"/>
+                <w:color w:val="18202B"/>
+                <w:sz w:val="19"/>
+              </w:rPr>
+              <w:t>)</w:t>
             </w:r>
           </w:p>
         </w:tc>
@@ -4287,7 +4773,7 @@
       <w:tr>
         <w:tc>
           <w:tcPr>
-            <w:tcW w:type="dxa" w:w="2381"/>
+            <w:tcW w:type="dxa" w:w="1474"/>
           </w:tcPr>
           <w:p>
             <w:pPr>
@@ -4300,13 +4786,40 @@
                 <w:color w:val="18202B"/>
                 <w:sz w:val="19"/>
               </w:rPr>
-              <w:t>SASL OAUTHBEARER</w:t>
+              <w:t>6 Oct, 17:31 UTC</w:t>
             </w:r>
           </w:p>
         </w:tc>
         <w:tc>
           <w:tcPr>
-            <w:tcW w:type="dxa" w:w="7257"/>
+            <w:tcW w:type="dxa" w:w="1701"/>
+          </w:tcPr>
+          <w:p>
+            <w:pPr>
+              <w:spacing w:before="40" w:after="40"/>
+            </w:pPr>
+            <w:r/>
+            <w:r>
+              <w:rPr>
+                <w:rFonts w:ascii="Consolas" w:hAnsi="Consolas"/>
+                <w:color w:val="18202B"/>
+                <w:sz w:val="17"/>
+              </w:rPr>
+              <w:t>_TRANSPORT</w:t>
+            </w:r>
+            <w:r>
+              <w:rPr>
+                <w:b w:val="0"/>
+                <w:color w:val="18202B"/>
+                <w:sz w:val="19"/>
+              </w:rPr>
+              <w:t xml:space="preserve"> after 60 s</w:t>
+            </w:r>
+          </w:p>
+        </w:tc>
+        <w:tc>
+          <w:tcPr>
+            <w:tcW w:type="dxa" w:w="3628"/>
           </w:tcPr>
           <w:p>
             <w:pPr>
@@ -4319,15 +4832,61 @@
                 <w:color w:val="18202B"/>
                 <w:sz w:val="19"/>
               </w:rPr>
-              <w:t>The broker accepts the BAM token and the principal.</w:t>
+              <w:t xml:space="preserve">On confluent-kafka 2.4, </w:t>
+            </w:r>
+            <w:r>
+              <w:rPr>
+                <w:rFonts w:ascii="Consolas" w:hAnsi="Consolas"/>
+                <w:color w:val="18202B"/>
+                <w:sz w:val="17"/>
+              </w:rPr>
+              <w:t>oauth_cb</w:t>
+            </w:r>
+            <w:r>
+              <w:rPr>
+                <w:b w:val="0"/>
+                <w:color w:val="18202B"/>
+                <w:sz w:val="19"/>
+              </w:rPr>
+              <w:t xml:space="preserve"> ran only at the first </w:t>
+            </w:r>
+            <w:r>
+              <w:rPr>
+                <w:rFonts w:ascii="Consolas" w:hAnsi="Consolas"/>
+                <w:color w:val="18202B"/>
+                <w:sz w:val="17"/>
+              </w:rPr>
+              <w:t>poll()</w:t>
+            </w:r>
+            <w:r>
+              <w:rPr>
+                <w:b w:val="0"/>
+                <w:color w:val="18202B"/>
+                <w:sz w:val="19"/>
+              </w:rPr>
+              <w:t xml:space="preserve">, after </w:t>
+            </w:r>
+            <w:r>
+              <w:rPr>
+                <w:rFonts w:ascii="Consolas" w:hAnsi="Consolas"/>
+                <w:color w:val="18202B"/>
+                <w:sz w:val="17"/>
+              </w:rPr>
+              <w:t>list_topics()</w:t>
+            </w:r>
+            <w:r>
+              <w:rPr>
+                <w:b w:val="0"/>
+                <w:color w:val="18202B"/>
+                <w:sz w:val="19"/>
+              </w:rPr>
+              <w:t xml:space="preserve"> had timed out</w:t>
             </w:r>
           </w:p>
         </w:tc>
-      </w:tr>
-      <w:tr>
         <w:tc>
           <w:tcPr>
-            <w:tcW w:type="dxa" w:w="2381"/>
+            <w:tcW w:type="dxa" w:w="2835"/>
           </w:tcPr>
           <w:p>
             <w:pPr>
@@ -4340,13 +4899,47 @@
                 <w:color w:val="18202B"/>
                 <w:sz w:val="19"/>
               </w:rPr>
-              <w:t>Metadata request</w:t>
+              <w:t>Poll for the token first (</w:t>
+            </w:r>
+            <w:r>
+              <w:rPr>
+                <w:rFonts w:ascii="Consolas" w:hAnsi="Consolas"/>
+                <w:color w:val="18202B"/>
+                <w:sz w:val="17"/>
+              </w:rPr>
+              <w:t>485e874</w:t>
+            </w:r>
+            <w:r>
+              <w:rPr>
+                <w:b w:val="0"/>
+                <w:color w:val="18202B"/>
+                <w:sz w:val="19"/>
+              </w:rPr>
+              <w:t>); metadata check off (</w:t>
+            </w:r>
+            <w:r>
+              <w:rPr>
+                <w:rFonts w:ascii="Consolas" w:hAnsi="Consolas"/>
+                <w:color w:val="18202B"/>
+                <w:sz w:val="17"/>
+              </w:rPr>
+              <w:t>7b77eeb</w:t>
+            </w:r>
+            <w:r>
+              <w:rPr>
+                <w:b w:val="0"/>
+                <w:color w:val="18202B"/>
+                <w:sz w:val="19"/>
+              </w:rPr>
+              <w:t>)</w:t>
             </w:r>
           </w:p>
         </w:tc>
+      </w:tr>
+      <w:tr>
         <w:tc>
           <w:tcPr>
-            <w:tcW w:type="dxa" w:w="7257"/>
+            <w:tcW w:type="dxa" w:w="1474"/>
           </w:tcPr>
           <w:p>
             <w:pPr>
@@ -4359,23 +4952,121 @@
                 <w:color w:val="18202B"/>
                 <w:sz w:val="19"/>
               </w:rPr>
-              <w:t>The topic exists, and the principal has DESCRIBE on it.</w:t>
+              <w:t>7 Oct</w:t>
             </w:r>
+          </w:p>
+        </w:tc>
+        <w:tc>
+          <w:tcPr>
+            <w:tcW w:type="dxa" w:w="1701"/>
+          </w:tcPr>
+          <w:p>
+            <w:pPr>
+              <w:spacing w:before="40" w:after="40"/>
+            </w:pPr>
+            <w:r/>
+            <w:r>
+              <w:rPr>
+                <w:b w:val="0"/>
+                <w:color w:val="18202B"/>
+                <w:sz w:val="19"/>
+              </w:rPr>
+              <w:t>Records published</w:t>
+            </w:r>
+          </w:p>
+        </w:tc>
+        <w:tc>
+          <w:tcPr>
+            <w:tcW w:type="dxa" w:w="3628"/>
+          </w:tcPr>
+          <w:p>
+            <w:pPr>
+              <w:spacing w:before="40" w:after="40"/>
+            </w:pPr>
+            <w:r/>
+          </w:p>
+        </w:tc>
+        <w:tc>
+          <w:tcPr>
+            <w:tcW w:type="dxa" w:w="2835"/>
+          </w:tcPr>
+          <w:p>
+            <w:pPr>
+              <w:spacing w:before="40" w:after="40"/>
+            </w:pPr>
+            <w:r/>
           </w:p>
         </w:tc>
       </w:tr>
     </w:tbl>
     <w:p>
       <w:pPr>
-        <w:spacing w:before="160" w:after="60"/>
-      </w:pPr>
+        <w:pStyle w:val="ListBullet"/>
+        <w:spacing w:before="80" w:after="60"/>
+      </w:pPr>
+      <w:r>
+        <w:rPr>
+          <w:b/>
+          <w:color w:val="18202B"/>
+          <w:sz w:val="21"/>
+        </w:rPr>
+        <w:t>The give-away:</w:t>
+      </w:r>
       <w:r>
         <w:rPr>
           <w:b w:val="0"/>
           <w:color w:val="18202B"/>
           <w:sz w:val="21"/>
         </w:rPr>
-        <w:t>What we found on the producer side:</w:t>
+        <w:t xml:space="preserve"> the connector's own </w:t>
+      </w:r>
+      <w:r>
+        <w:rPr>
+          <w:rFonts w:ascii="Consolas" w:hAnsi="Consolas"/>
+          <w:color w:val="18202B"/>
+          <w:sz w:val="19"/>
+        </w:rPr>
+        <w:t>oauth_cb supplied a token</w:t>
+      </w:r>
+      <w:r>
+        <w:rPr>
+          <w:b w:val="0"/>
+          <w:color w:val="18202B"/>
+          <w:sz w:val="21"/>
+        </w:rPr>
+        <w:t xml:space="preserve"> line was stamped 17:32:08.584, 60 seconds after the producer was created and the instant the failure path called </w:t>
+      </w:r>
+      <w:r>
+        <w:rPr>
+          <w:rFonts w:ascii="Consolas" w:hAnsi="Consolas"/>
+          <w:color w:val="18202B"/>
+          <w:sz w:val="19"/>
+        </w:rPr>
+        <w:t>poll(0)</w:t>
+      </w:r>
+      <w:r>
+        <w:rPr>
+          <w:b w:val="0"/>
+          <w:color w:val="18202B"/>
+          <w:sz w:val="21"/>
+        </w:rPr>
+        <w:t xml:space="preserve">. librdkafka's own lines carried the same time only because they are queued until </w:t>
+      </w:r>
+      <w:r>
+        <w:rPr>
+          <w:rFonts w:ascii="Consolas" w:hAnsi="Consolas"/>
+          <w:color w:val="18202B"/>
+          <w:sz w:val="19"/>
+        </w:rPr>
+        <w:t>poll()</w:t>
+      </w:r>
+      <w:r>
+        <w:rPr>
+          <w:b w:val="0"/>
+          <w:color w:val="18202B"/>
+          <w:sz w:val="21"/>
+        </w:rPr>
+        <w:t xml:space="preserve"> releases them, which made the trace look as if the brokers had only milliseconds to connect.</w:t>
       </w:r>
     </w:p>
     <w:p>
@@ -4389,7 +5080,7 @@
           <w:color w:val="18202B"/>
           <w:sz w:val="21"/>
         </w:rPr>
-        <w:t>First run (12:14 UTC):</w:t>
+        <w:t>Reproduced locally on the image's client:</w:t>
       </w:r>
       <w:r>
         <w:rPr>
@@ -4397,7 +5088,7 @@
           <w:color w:val="18202B"/>
           <w:sz w:val="21"/>
         </w:rPr>
-        <w:t xml:space="preserve"> the BSP client config said </w:t>
+        <w:t xml:space="preserve"> on confluent-kafka 2.4.0, </w:t>
       </w:r>
       <w:r>
         <w:rPr>
@@ -4405,7 +5096,7 @@
           <w:color w:val="18202B"/>
           <w:sz w:val="19"/>
         </w:rPr>
-        <w:t>security.protocol: PLAINTEXT</w:t>
+        <w:t>oauth_cb</w:t>
       </w:r>
       <w:r>
         <w:rPr>
@@ -4413,7 +5104,7 @@
           <w:color w:val="18202B"/>
           <w:sz w:val="21"/>
         </w:rPr>
-        <w:t xml:space="preserve">, so the producer sent neither TLS nor the token, and the brokers dropped the connection. Fixed: it is now </w:t>
+        <w:t xml:space="preserve"> ran at 3.0 s, after </w:t>
       </w:r>
       <w:r>
         <w:rPr>
@@ -4421,7 +5112,7 @@
           <w:color w:val="18202B"/>
           <w:sz w:val="19"/>
         </w:rPr>
-        <w:t>SASL_SSL</w:t>
+        <w:t>list_topics()</w:t>
       </w:r>
       <w:r>
         <w:rPr>
@@ -4429,7 +5120,7 @@
           <w:color w:val="18202B"/>
           <w:sz w:val="21"/>
         </w:rPr>
-        <w:t>.</w:t>
+        <w:t xml:space="preserve"> had already failed, and no SASL traffic reached the broker. With the token wait it ran at 0.02 s and SASL started. confluent-kafka 2.15 calls the callback without a poll, which is why a first local test missed it.</w:t>
       </w:r>
     </w:p>
     <w:p>
@@ -4443,7 +5134,7 @@
           <w:color w:val="18202B"/>
           <w:sz w:val="21"/>
         </w:rPr>
-        <w:t>Next run:</w:t>
+        <w:t>Why produce_app never hit it:</w:t>
       </w:r>
       <w:r>
         <w:rPr>
@@ -4451,7 +5142,7 @@
           <w:color w:val="18202B"/>
           <w:sz w:val="21"/>
         </w:rPr>
-        <w:t xml:space="preserve"> </w:t>
+        <w:t xml:space="preserve"> it calls </w:t>
       </w:r>
       <w:r>
         <w:rPr>
@@ -4459,7 +5150,7 @@
           <w:color w:val="18202B"/>
           <w:sz w:val="19"/>
         </w:rPr>
-        <w:t>SASL_SSL</w:t>
+        <w:t>produce()</w:t>
       </w:r>
       <w:r>
         <w:rPr>
@@ -4467,7 +5158,7 @@
           <w:color w:val="18202B"/>
           <w:sz w:val="21"/>
         </w:rPr>
-        <w:t xml:space="preserve">, but the brokers in the config were on port </w:t>
+        <w:t xml:space="preserve"> and then </w:t>
       </w:r>
       <w:r>
         <w:rPr>
@@ -4475,7 +5166,7 @@
           <w:color w:val="18202B"/>
           <w:sz w:val="19"/>
         </w:rPr>
-        <w:t>9092</w:t>
+        <w:t>poll(0)</w:t>
       </w:r>
       <w:r>
         <w:rPr>
@@ -4483,7 +5174,7 @@
           <w:color w:val="18202B"/>
           <w:sz w:val="21"/>
         </w:rPr>
-        <w:t xml:space="preserve">. The Barclays SASL_SSL listener is </w:t>
+        <w:t xml:space="preserve"> for every record and never blocks on the brokers first, so the token is set before librdkafka needs it. Its token path is otherwise identical: the same BSP </w:t>
       </w:r>
       <w:r>
         <w:rPr>
@@ -4491,7 +5182,7 @@
           <w:color w:val="18202B"/>
           <w:sz w:val="19"/>
         </w:rPr>
-        <w:t>9095</w:t>
+        <w:t>oauth_cb</w:t>
       </w:r>
       <w:r>
         <w:rPr>
@@ -4499,7 +5190,7 @@
           <w:color w:val="18202B"/>
           <w:sz w:val="21"/>
         </w:rPr>
-        <w:t xml:space="preserve">, so the TLS handshake would fail. A local reproduction against a non-TLS port gives exactly this error. Fixed: all brokers on </w:t>
+        <w:t xml:space="preserve">, the same </w:t>
       </w:r>
       <w:r>
         <w:rPr>
@@ -4507,7 +5198,7 @@
           <w:color w:val="18202B"/>
           <w:sz w:val="19"/>
         </w:rPr>
-        <w:t>9095</w:t>
+        <w:t>get_token</w:t>
       </w:r>
       <w:r>
         <w:rPr>
@@ -4515,7 +5206,7 @@
           <w:color w:val="18202B"/>
           <w:sz w:val="21"/>
         </w:rPr>
-        <w:t>.</w:t>
+        <w:t xml:space="preserve"> for the Schema Registry.</w:t>
       </w:r>
     </w:p>
     <w:p>
@@ -4529,7 +5220,7 @@
           <w:color w:val="18202B"/>
           <w:sz w:val="21"/>
         </w:rPr>
-        <w:t>CA bundle confirmed:</w:t>
+        <w:t>What was right all along:</w:t>
       </w:r>
       <w:r>
         <w:rPr>
@@ -4537,7 +5228,7 @@
           <w:color w:val="18202B"/>
           <w:sz w:val="21"/>
         </w:rPr>
-        <w:t xml:space="preserve"> </w:t>
+        <w:t xml:space="preserve"> the CA bundle (</w:t>
       </w:r>
       <w:r>
         <w:rPr>
@@ -4553,7 +5244,7 @@
           <w:color w:val="18202B"/>
           <w:sz w:val="21"/>
         </w:rPr>
-        <w:t xml:space="preserve"> to </w:t>
+        <w:t xml:space="preserve"> returned </w:t>
       </w:r>
       <w:r>
         <w:rPr>
@@ -4561,7 +5252,7 @@
           <w:color w:val="18202B"/>
           <w:sz w:val="19"/>
         </w:rPr>
-        <w:t>ldndsr000009480:9095</w:t>
+        <w:t>Verify return code: 0 (ok)</w:t>
       </w:r>
       <w:r>
         <w:rPr>
@@ -4569,7 +5260,28 @@
           <w:color w:val="18202B"/>
           <w:sz w:val="21"/>
         </w:rPr>
-        <w:t xml:space="preserve"> with our </w:t>
+        <w:t>), CyberArk, the BAM token and its claims, port 9095, DNS and TCP, and the Schema Registry.</w:t>
+      </w:r>
+    </w:p>
+    <w:p>
+      <w:pPr>
+        <w:pStyle w:val="Heading1"/>
+      </w:pPr>
+      <w:r>
+        <w:t>The metadata check now</w:t>
+      </w:r>
+    </w:p>
+    <w:p>
+      <w:pPr>
+        <w:spacing w:before="0" w:after="120"/>
+      </w:pPr>
+      <w:r>
+        <w:rPr>
+          <w:b w:val="0"/>
+          <w:color w:val="18202B"/>
+          <w:sz w:val="21"/>
+        </w:rPr>
+        <w:t xml:space="preserve">The explicit </w:t>
       </w:r>
       <w:r>
         <w:rPr>
@@ -4577,7 +5289,7 @@
           <w:color w:val="18202B"/>
           <w:sz w:val="19"/>
         </w:rPr>
-        <w:t>CARoot.pem</w:t>
+        <w:t>list_topics()</w:t>
       </w:r>
       <w:r>
         <w:rPr>
@@ -4585,7 +5297,20 @@
           <w:color w:val="18202B"/>
           <w:sz w:val="21"/>
         </w:rPr>
-        <w:t xml:space="preserve"> returns </w:t>
+        <w:t xml:space="preserve"> before reading any rows is off by default. The connector now does what produce_app does on the same cluster: it gives librdkafka the token, and the first publish brings up the connection, fetching the topic metadata on the way.</w:t>
+      </w:r>
+    </w:p>
+    <w:p>
+      <w:pPr>
+        <w:spacing w:before="0" w:after="120"/>
+      </w:pPr>
+      <w:r>
+        <w:rPr>
+          <w:b w:val="0"/>
+          <w:color w:val="18202B"/>
+          <w:sz w:val="21"/>
+        </w:rPr>
+        <w:t xml:space="preserve">If the connection breaks in future, the run reads the month's rows first and then fails at publishing: a missing topic or ACL comes back as each record's delivery error, and a dead connection as records still queued after the 120-second flush. Nothing reaches the topic either way. To get the earlier fast failure, with librdkafka's reason for each broker, set </w:t>
       </w:r>
       <w:r>
         <w:rPr>
@@ -4593,7 +5318,7 @@
           <w:color w:val="18202B"/>
           <w:sz w:val="19"/>
         </w:rPr>
-        <w:t>Verify return code: 0 (ok)</w:t>
+        <w:t>IFC_RESILIENCE__PREFLIGHT_METADATA_ENABLED=true</w:t>
       </w:r>
       <w:r>
         <w:rPr>
@@ -4601,7 +5326,7 @@
           <w:color w:val="18202B"/>
           <w:sz w:val="21"/>
         </w:rPr>
-        <w:t xml:space="preserve">. The chain is the broker → </w:t>
+        <w:t xml:space="preserve"> (and </w:t>
       </w:r>
       <w:r>
         <w:rPr>
@@ -4609,7 +5334,7 @@
           <w:color w:val="18202B"/>
           <w:sz w:val="19"/>
         </w:rPr>
-        <w:t>CSM-STG UK IN NP Issuing CA 2</w:t>
+        <w:t>IFC_KAFKA__DEBUG=security,broker,protocol</w:t>
       </w:r>
       <w:r>
         <w:rPr>
@@ -4617,143 +5342,32 @@
           <w:color w:val="18202B"/>
           <w:sz w:val="21"/>
         </w:rPr>
-        <w:t xml:space="preserve"> → </w:t>
-      </w:r>
-      <w:r>
-        <w:rPr>
-          <w:rFonts w:ascii="Consolas" w:hAnsi="Consolas"/>
-          <w:color w:val="18202B"/>
-          <w:sz w:val="19"/>
-        </w:rPr>
-        <w:t>TEST BARCLAYS INTERNAL Root CA G1</w:t>
-      </w:r>
+        <w:t xml:space="preserve"> for the full trace).</w:t>
+      </w:r>
+    </w:p>
+    <w:p>
+      <w:pPr>
+        <w:pStyle w:val="Heading1"/>
+      </w:pPr>
+      <w:r>
+        <w:t>For the consumer team</w:t>
+      </w:r>
+    </w:p>
+    <w:p>
+      <w:pPr>
+        <w:spacing w:before="0" w:after="120"/>
+      </w:pPr>
       <w:r>
         <w:rPr>
           <w:b w:val="0"/>
           <w:color w:val="18202B"/>
           <w:sz w:val="21"/>
         </w:rPr>
-        <w:t>.</w:t>
+        <w:t>Publishing works, which settles the earlier questions about the brokers, the topic, the ACLs and SASL with BAM tokens. What is left is on the consuming side:</w:t>
       </w:r>
     </w:p>
     <w:p>
       <w:pPr>
-        <w:spacing w:before="120" w:after="120"/>
-      </w:pPr>
-      <w:r>
-        <w:rPr>
-          <w:b w:val="0"/>
-          <w:color w:val="18202B"/>
-          <w:sz w:val="21"/>
-        </w:rPr>
-        <w:t xml:space="preserve">The connector now logs librdkafka's own reason for each dropped connection (TLS, SASL or ACL), the effective protocol, port and CA path, and what the BSP OAuth callback hands librdkafka. It allows 60 seconds instead of 10. Setting </w:t>
-      </w:r>
-      <w:r>
-        <w:rPr>
-          <w:rFonts w:ascii="Consolas" w:hAnsi="Consolas"/>
-          <w:color w:val="18202B"/>
-          <w:sz w:val="19"/>
-        </w:rPr>
-        <w:t>IFC_KAFKA__DEBUG=security,broker,protocol</w:t>
-      </w:r>
-      <w:r>
-        <w:rPr>
-          <w:b w:val="0"/>
-          <w:color w:val="18202B"/>
-          <w:sz w:val="21"/>
-        </w:rPr>
-        <w:t xml:space="preserve"> on the task adds librdkafka's full trace of the connection.</w:t>
-      </w:r>
-    </w:p>
-    <w:p>
-      <w:pPr>
-        <w:pStyle w:val="Heading1"/>
-      </w:pPr>
-      <w:r>
-        <w:t>Is the metadata step necessary?</w:t>
-      </w:r>
-    </w:p>
-    <w:p>
-      <w:pPr>
-        <w:spacing w:before="0" w:after="120"/>
-      </w:pPr>
-      <w:r>
-        <w:rPr>
-          <w:b w:val="0"/>
-          <w:color w:val="18202B"/>
-          <w:sz w:val="21"/>
-        </w:rPr>
-        <w:t>Yes. It isn't an extra check that can be dropped. It is the same connection, with the same TLS, the same token and the same principal, that publishing uses. Running it before any record is read means a broken connection, a missing topic or a missing ACL stops the run cleanly with a specific error.</w:t>
-      </w:r>
-    </w:p>
-    <w:p>
-      <w:pPr>
-        <w:spacing w:before="0" w:after="120"/>
-      </w:pPr>
-      <w:r>
-        <w:rPr>
-          <w:b w:val="0"/>
-          <w:color w:val="18202B"/>
-          <w:sz w:val="21"/>
-        </w:rPr>
-        <w:t>Without it, the connector would read the month's rows, every record would wait 5 minutes (</w:t>
-      </w:r>
-      <w:r>
-        <w:rPr>
-          <w:rFonts w:ascii="Consolas" w:hAnsi="Consolas"/>
-          <w:color w:val="18202B"/>
-          <w:sz w:val="19"/>
-        </w:rPr>
-        <w:t>message.timeout.ms</w:t>
-      </w:r>
-      <w:r>
-        <w:rPr>
-          <w:b w:val="0"/>
-          <w:color w:val="18202B"/>
-          <w:sz w:val="21"/>
-        </w:rPr>
-        <w:t>) and then fail, and the run would end as a failed batch to reconcile, for the same underlying cause. Turning it off (</w:t>
-      </w:r>
-      <w:r>
-        <w:rPr>
-          <w:rFonts w:ascii="Consolas" w:hAnsi="Consolas"/>
-          <w:color w:val="18202B"/>
-          <w:sz w:val="19"/>
-        </w:rPr>
-        <w:t>resilience.preflight_enabled: false</w:t>
-      </w:r>
-      <w:r>
-        <w:rPr>
-          <w:b w:val="0"/>
-          <w:color w:val="18202B"/>
-          <w:sz w:val="21"/>
-        </w:rPr>
-        <w:t>) moves the failure to step 15 and makes it harder to diagnose.</w:t>
-      </w:r>
-    </w:p>
-    <w:p>
-      <w:pPr>
-        <w:pStyle w:val="Heading1"/>
-      </w:pPr>
-      <w:r>
-        <w:t>What we need from the consumer team</w:t>
-      </w:r>
-    </w:p>
-    <w:p>
-      <w:pPr>
-        <w:spacing w:before="0" w:after="120"/>
-      </w:pPr>
-      <w:r>
-        <w:rPr>
-          <w:b w:val="0"/>
-          <w:color w:val="18202B"/>
-          <w:sz w:val="21"/>
-        </w:rPr>
-        <w:t>If any of these is owned by another team (BSP platform, topic owners), please point us to them.</w:t>
-      </w:r>
-    </w:p>
-    <w:p>
-      <w:pPr>
         <w:keepNext/>
         <w:spacing w:before="120" w:after="20"/>
       </w:pPr>
@@ -4762,7 +5376,7 @@
           <w:b/>
           <w:color w:val="1F5F8B"/>
         </w:rPr>
-        <w:t>1.  Bootstrap brokers for this topic in SIT</w:t>
+        <w:t>1.  Records arrive and decode</w:t>
       </w:r>
     </w:p>
     <w:p>
@@ -4776,7 +5390,7 @@
           <w:color w:val="18202B"/>
           <w:sz w:val="20"/>
         </w:rPr>
-        <w:t xml:space="preserve">Our config lists </w:t>
+        <w:t xml:space="preserve">Please confirm you receive the 7 October records on </w:t>
       </w:r>
       <w:r>
         <w:rPr>
@@ -4784,7 +5398,7 @@
           <w:color w:val="18202B"/>
           <w:sz w:val="18"/>
         </w:rPr>
-        <w:t>ldndsr000009490</w:t>
+        <w:t>tc01_fncmtrgrbb_ifc_tbb_kyc_refresh</w:t>
       </w:r>
       <w:r>
         <w:rPr>
@@ -4792,7 +5406,7 @@
           <w:color w:val="18202B"/>
           <w:sz w:val="20"/>
         </w:rPr>
-        <w:t xml:space="preserve">, </w:t>
+        <w:t xml:space="preserve"> and decode them with schema ID 3665 (version 2) of </w:t>
       </w:r>
       <w:r>
         <w:rPr>
@@ -4800,7 +5414,7 @@
           <w:color w:val="18202B"/>
           <w:sz w:val="18"/>
         </w:rPr>
-        <w:t>ldndsr000009491</w:t>
+        <w:t>tc01_fncmtrgrbb_ifc_tbb_kyc_refresh-value</w:t>
       </w:r>
       <w:r>
         <w:rPr>
@@ -4808,7 +5422,34 @@
           <w:color w:val="18202B"/>
           <w:sz w:val="20"/>
         </w:rPr>
-        <w:t xml:space="preserve"> and </w:t>
+        <w:t>, Confluent wire format.</w:t>
+      </w:r>
+    </w:p>
+    <w:p>
+      <w:pPr>
+        <w:keepNext/>
+        <w:spacing w:before="120" w:after="20"/>
+      </w:pPr>
+      <w:r>
+        <w:rPr>
+          <w:b/>
+          <w:color w:val="1F5F8B"/>
+        </w:rPr>
+        <w:t>2.  The namespace difference</w:t>
+      </w:r>
+    </w:p>
+    <w:p>
+      <w:pPr>
+        <w:spacing w:before="0" w:after="40"/>
+        <w:ind w:left="340"/>
+      </w:pPr>
+      <w:r>
+        <w:rPr>
+          <w:b w:val="0"/>
+          <w:color w:val="18202B"/>
+          <w:sz w:val="20"/>
+        </w:rPr>
+        <w:t xml:space="preserve">Our bundled schema's record is </w:t>
       </w:r>
       <w:r>
         <w:rPr>
@@ -4816,7 +5457,7 @@
           <w:color w:val="18202B"/>
           <w:sz w:val="18"/>
         </w:rPr>
-        <w:t>gbrdsr000012098</w:t>
+        <w:t>.TriggerBackboneTopicSchema</w:t>
       </w:r>
       <w:r>
         <w:rPr>
@@ -4824,7 +5465,7 @@
           <w:color w:val="18202B"/>
           <w:sz w:val="20"/>
         </w:rPr>
-        <w:t xml:space="preserve"> on 9095. The host we verified is </w:t>
+        <w:t xml:space="preserve">; the registered one is </w:t>
       </w:r>
       <w:r>
         <w:rPr>
@@ -4832,7 +5473,7 @@
           <w:color w:val="18202B"/>
           <w:sz w:val="18"/>
         </w:rPr>
-        <w:t>ldndsr000009480</w:t>
+        <w:t>com.barclays.trigger.backbone.producer.bsp.schema.model.TriggerBackboneTopicSchema</w:t>
       </w:r>
       <w:r>
         <w:rPr>
@@ -4840,179 +5481,34 @@
           <w:color w:val="18202B"/>
           <w:sz w:val="20"/>
         </w:rPr>
-        <w:t xml:space="preserve">. Please confirm which cluster hosts </w:t>
-      </w:r>
-      <w:r>
-        <w:rPr>
-          <w:rFonts w:ascii="Consolas" w:hAnsi="Consolas"/>
-          <w:color w:val="18202B"/>
-          <w:sz w:val="18"/>
-        </w:rPr>
-        <w:t>tc01_fncmtrgrbb_ifc_tbb_kyc_refresh</w:t>
-      </w:r>
+        <w:t>. Every field matches. If your deserializer resolves by full name, tell us and we will align the namespace.</w:t>
+      </w:r>
+    </w:p>
+    <w:p>
+      <w:pPr>
+        <w:keepNext/>
+        <w:spacing w:before="120" w:after="20"/>
+      </w:pPr>
+      <w:r>
+        <w:rPr>
+          <w:b/>
+          <w:color w:val="1F5F8B"/>
+        </w:rPr>
+        <w:t>3.  Message key</w:t>
+      </w:r>
+    </w:p>
+    <w:p>
+      <w:pPr>
+        <w:spacing w:before="0" w:after="40"/>
+        <w:ind w:left="340"/>
+      </w:pPr>
       <w:r>
         <w:rPr>
           <w:b w:val="0"/>
           <w:color w:val="18202B"/>
           <w:sz w:val="20"/>
         </w:rPr>
-        <w:t xml:space="preserve"> and its bootstrap list.</w:t>
-      </w:r>
-    </w:p>
-    <w:p>
-      <w:pPr>
-        <w:keepNext/>
-        <w:spacing w:before="120" w:after="20"/>
-      </w:pPr>
-      <w:r>
-        <w:rPr>
-          <w:b/>
-          <w:color w:val="1F5F8B"/>
-        </w:rPr>
-        <w:t>2.  The topic exists on that cluster</w:t>
-      </w:r>
-    </w:p>
-    <w:p>
-      <w:pPr>
-        <w:spacing w:before="0" w:after="40"/>
-        <w:ind w:left="340"/>
-      </w:pPr>
-      <w:r>
-        <w:rPr>
-          <w:rFonts w:ascii="Consolas" w:hAnsi="Consolas"/>
-          <w:color w:val="18202B"/>
-          <w:sz w:val="18"/>
-        </w:rPr>
-        <w:t>tc01_fncmtrgrbb_ifc_tbb_kyc_refresh</w:t>
-      </w:r>
-      <w:r>
-        <w:rPr>
-          <w:b w:val="0"/>
-          <w:color w:val="18202B"/>
-          <w:sz w:val="20"/>
-        </w:rPr>
-        <w:t>, with its partition count.</w:t>
-      </w:r>
-    </w:p>
-    <w:p>
-      <w:pPr>
-        <w:keepNext/>
-        <w:spacing w:before="120" w:after="20"/>
-      </w:pPr>
-      <w:r>
-        <w:rPr>
-          <w:b/>
-          <w:color w:val="1F5F8B"/>
-        </w:rPr>
-        <w:t>3.  ACLs for the producer principal</w:t>
-      </w:r>
-    </w:p>
-    <w:p>
-      <w:pPr>
-        <w:spacing w:before="0" w:after="40"/>
-        <w:ind w:left="340"/>
-      </w:pPr>
-      <w:r>
-        <w:rPr>
-          <w:rFonts w:ascii="Consolas" w:hAnsi="Consolas"/>
-          <w:color w:val="18202B"/>
-          <w:sz w:val="18"/>
-        </w:rPr>
-        <w:t>sysEUWCorpDEngSit@INTRANET.BARCAPINT.COM</w:t>
-      </w:r>
-      <w:r>
-        <w:rPr>
-          <w:b w:val="0"/>
-          <w:color w:val="18202B"/>
-          <w:sz w:val="20"/>
-        </w:rPr>
-        <w:t xml:space="preserve"> needs WRITE and DESCRIBE on the topic and, on Kafka versions before 2.8, IdempotentWrite on the cluster (the producer uses idempotence). DESCRIBE is what the metadata step needs.</w:t>
-      </w:r>
-    </w:p>
-    <w:p>
-      <w:pPr>
-        <w:keepNext/>
-        <w:spacing w:before="120" w:after="20"/>
-      </w:pPr>
-      <w:r>
-        <w:rPr>
-          <w:b/>
-          <w:color w:val="1F5F8B"/>
-        </w:rPr>
-        <w:t>4.  SASL OAUTHBEARER with BAM is enabled on 9095</w:t>
-      </w:r>
-    </w:p>
-    <w:p>
-      <w:pPr>
-        <w:spacing w:before="0" w:after="40"/>
-        <w:ind w:left="340"/>
-      </w:pPr>
-      <w:r>
-        <w:rPr>
-          <w:b w:val="0"/>
-          <w:color w:val="18202B"/>
-          <w:sz w:val="20"/>
-        </w:rPr>
-        <w:t xml:space="preserve">Tokens come from BAM, </w:t>
-      </w:r>
-      <w:r>
-        <w:rPr>
-          <w:rFonts w:ascii="Consolas" w:hAnsi="Consolas"/>
-          <w:color w:val="18202B"/>
-          <w:sz w:val="18"/>
-        </w:rPr>
-        <w:t>BAM_NAME=BarclaysStreamingPlatform</w:t>
-      </w:r>
-      <w:r>
-        <w:rPr>
-          <w:b w:val="0"/>
-          <w:color w:val="18202B"/>
-          <w:sz w:val="20"/>
-        </w:rPr>
-        <w:t>. Please confirm the brokers accept it for this principal.</w:t>
-      </w:r>
-    </w:p>
-    <w:p>
-      <w:pPr>
-        <w:keepNext/>
-        <w:spacing w:before="120" w:after="20"/>
-      </w:pPr>
-      <w:r>
-        <w:rPr>
-          <w:b/>
-          <w:color w:val="1F5F8B"/>
-        </w:rPr>
-        <w:t>5.  The schema you decode with</w:t>
-      </w:r>
-    </w:p>
-    <w:p>
-      <w:pPr>
-        <w:spacing w:before="0" w:after="40"/>
-        <w:ind w:left="340"/>
-      </w:pPr>
-      <w:r>
-        <w:rPr>
-          <w:b w:val="0"/>
-          <w:color w:val="18202B"/>
-          <w:sz w:val="20"/>
-        </w:rPr>
-        <w:t xml:space="preserve">We will write with schema ID 3665 (version 2) of </w:t>
-      </w:r>
-      <w:r>
-        <w:rPr>
-          <w:rFonts w:ascii="Consolas" w:hAnsi="Consolas"/>
-          <w:color w:val="18202B"/>
-          <w:sz w:val="18"/>
-        </w:rPr>
-        <w:t>tc01_fncmtrgrbb_ifc_tbb_kyc_refresh-value</w:t>
-      </w:r>
-      <w:r>
-        <w:rPr>
-          <w:b w:val="0"/>
-          <w:color w:val="18202B"/>
-          <w:sz w:val="20"/>
-        </w:rPr>
-        <w:t>, framed in the Confluent wire format. Please confirm that is what your consumer expects.</w:t>
+        <w:t>Each record's key is its trigger ID (UTF-8), with no Kafka headers. Please confirm that is what you expect.</w:t>
       </w:r>
     </w:p>
     <w:p>
@@ -5025,7 +5521,6 @@
     </w:p>
     <w:tbl>
       <w:tblPr>
-        <w:tblStyle w:val="TableGrid"/>
         <w:tblW w:type="auto" w:w="0"/>
         <w:jc w:val="left"/>
         <w:tblLayout w:type="fixed"/>
@@ -5047,7 +5542,7 @@
       <w:tr>
         <w:tc>
           <w:tcPr>
-            <w:tcW w:type="dxa" w:w="1928"/>
+            <w:tcW w:type="dxa" w:w="2041"/>
             <w:shd w:val="clear" w:color="auto" w:fill="EEF0F3"/>
           </w:tcPr>
           <w:p>
@@ -5087,7 +5582,7 @@
         </w:tc>
         <w:tc>
           <w:tcPr>
-            <w:tcW w:type="dxa" w:w="3969"/>
+            <w:tcW w:type="dxa" w:w="3855"/>
             <w:shd w:val="clear" w:color="auto" w:fill="EEF0F3"/>
           </w:tcPr>
           <w:p>
@@ -5109,7 +5604,7 @@
       <w:tr>
         <w:tc>
           <w:tcPr>
-            <w:tcW w:type="dxa" w:w="1928"/>
+            <w:tcW w:type="dxa" w:w="2041"/>
           </w:tcPr>
           <w:p>
             <w:pPr>
@@ -5141,13 +5636,13 @@
                 <w:color w:val="18202B"/>
                 <w:sz w:val="17"/>
               </w:rPr>
-              <w:t>utility/kafka_factory.py:511 build()</w:t>
+              <w:t>utility/kafka_factory.py:548 build()</w:t>
             </w:r>
           </w:p>
         </w:tc>
         <w:tc>
           <w:tcPr>
-            <w:tcW w:type="dxa" w:w="3969"/>
+            <w:tcW w:type="dxa" w:w="3855"/>
           </w:tcPr>
           <w:p>
             <w:pPr>
@@ -5160,7 +5655,7 @@
                 <w:color w:val="18202B"/>
                 <w:sz w:val="19"/>
               </w:rPr>
-              <w:t>Runs steps 4 to 12 in order. Any failure stops the run.</w:t>
+              <w:t>Runs steps 4 to 13 in order. Any failure stops the run.</w:t>
             </w:r>
           </w:p>
         </w:tc>
@@ -5168,7 +5663,7 @@
       <w:tr>
         <w:tc>
           <w:tcPr>
-            <w:tcW w:type="dxa" w:w="1928"/>
+            <w:tcW w:type="dxa" w:w="2041"/>
           </w:tcPr>
           <w:p>
             <w:pPr>
@@ -5206,7 +5701,7 @@
         </w:tc>
         <w:tc>
           <w:tcPr>
-            <w:tcW w:type="dxa" w:w="3969"/>
+            <w:tcW w:type="dxa" w:w="3855"/>
           </w:tcPr>
           <w:p>
             <w:pPr>
@@ -5235,7 +5730,7 @@
       <w:tr>
         <w:tc>
           <w:tcPr>
-            <w:tcW w:type="dxa" w:w="1928"/>
+            <w:tcW w:type="dxa" w:w="2041"/>
           </w:tcPr>
           <w:p>
             <w:pPr>
@@ -5273,7 +5768,7 @@
         </w:tc>
         <w:tc>
           <w:tcPr>
-            <w:tcW w:type="dxa" w:w="3969"/>
+            <w:tcW w:type="dxa" w:w="3855"/>
           </w:tcPr>
           <w:p>
             <w:pPr>
@@ -5318,7 +5813,7 @@
       <w:tr>
         <w:tc>
           <w:tcPr>
-            <w:tcW w:type="dxa" w:w="1928"/>
+            <w:tcW w:type="dxa" w:w="2041"/>
           </w:tcPr>
           <w:p>
             <w:pPr>
@@ -5356,7 +5851,7 @@
         </w:tc>
         <w:tc>
           <w:tcPr>
-            <w:tcW w:type="dxa" w:w="3969"/>
+            <w:tcW w:type="dxa" w:w="3855"/>
           </w:tcPr>
           <w:p>
             <w:pPr>
@@ -5409,7 +5904,7 @@
       <w:tr>
         <w:tc>
           <w:tcPr>
-            <w:tcW w:type="dxa" w:w="1928"/>
+            <w:tcW w:type="dxa" w:w="2041"/>
           </w:tcPr>
           <w:p>
             <w:pPr>
@@ -5447,7 +5942,7 @@
         </w:tc>
         <w:tc>
           <w:tcPr>
-            <w:tcW w:type="dxa" w:w="3969"/>
+            <w:tcW w:type="dxa" w:w="3855"/>
           </w:tcPr>
           <w:p>
             <w:pPr>
@@ -5468,7 +5963,7 @@
       <w:tr>
         <w:tc>
           <w:tcPr>
-            <w:tcW w:type="dxa" w:w="1928"/>
+            <w:tcW w:type="dxa" w:w="2041"/>
           </w:tcPr>
           <w:p>
             <w:pPr>
@@ -5506,7 +6001,7 @@
         </w:tc>
         <w:tc>
           <w:tcPr>
-            <w:tcW w:type="dxa" w:w="3969"/>
+            <w:tcW w:type="dxa" w:w="3855"/>
           </w:tcPr>
           <w:p>
             <w:pPr>
@@ -5527,7 +6022,7 @@
       <w:tr>
         <w:tc>
           <w:tcPr>
-            <w:tcW w:type="dxa" w:w="1928"/>
+            <w:tcW w:type="dxa" w:w="2041"/>
           </w:tcPr>
           <w:p>
             <w:pPr>
@@ -5540,7 +6035,7 @@
                 <w:color w:val="18202B"/>
                 <w:sz w:val="19"/>
               </w:rPr>
-              <w:t>11 · Metadata</w:t>
+              <w:t>11 · Token (the fix)</w:t>
             </w:r>
           </w:p>
         </w:tc>
@@ -5559,13 +6054,88 @@
                 <w:color w:val="18202B"/>
                 <w:sz w:val="17"/>
               </w:rPr>
-              <w:t>utility/kafka_factory.py:448 _metadata_checks</w:t>
+              <w:t>utility/kafka_factory.py:455 _await_oauth_token</w:t>
             </w:r>
           </w:p>
         </w:tc>
         <w:tc>
           <w:tcPr>
-            <w:tcW w:type="dxa" w:w="3969"/>
+            <w:tcW w:type="dxa" w:w="3855"/>
+          </w:tcPr>
+          <w:p>
+            <w:pPr>
+              <w:spacing w:before="40" w:after="40"/>
+            </w:pPr>
+            <w:r/>
+            <w:r>
+              <w:rPr>
+                <w:b w:val="0"/>
+                <w:color w:val="18202B"/>
+                <w:sz w:val="19"/>
+              </w:rPr>
+              <w:t xml:space="preserve">Polls until BSP's </w:t>
+            </w:r>
+            <w:r>
+              <w:rPr>
+                <w:rFonts w:ascii="Consolas" w:hAnsi="Consolas"/>
+                <w:color w:val="18202B"/>
+                <w:sz w:val="17"/>
+              </w:rPr>
+              <w:t>oauth_cb</w:t>
+            </w:r>
+            <w:r>
+              <w:rPr>
+                <w:b w:val="0"/>
+                <w:color w:val="18202B"/>
+                <w:sz w:val="19"/>
+              </w:rPr>
+              <w:t xml:space="preserve"> has supplied the token</w:t>
+            </w:r>
+          </w:p>
+        </w:tc>
+      </w:tr>
+      <w:tr>
+        <w:tc>
+          <w:tcPr>
+            <w:tcW w:type="dxa" w:w="2041"/>
+          </w:tcPr>
+          <w:p>
+            <w:pPr>
+              <w:spacing w:before="40" w:after="40"/>
+            </w:pPr>
+            <w:r/>
+            <w:r>
+              <w:rPr>
+                <w:b w:val="0"/>
+                <w:color w:val="18202B"/>
+                <w:sz w:val="19"/>
+              </w:rPr>
+              <w:t>12 · Metadata (off)</w:t>
+            </w:r>
+          </w:p>
+        </w:tc>
+        <w:tc>
+          <w:tcPr>
+            <w:tcW w:type="dxa" w:w="3742"/>
+          </w:tcPr>
+          <w:p>
+            <w:pPr>
+              <w:spacing w:before="40" w:after="40"/>
+            </w:pPr>
+            <w:r/>
+            <w:r>
+              <w:rPr>
+                <w:rFonts w:ascii="Consolas" w:hAnsi="Consolas"/>
+                <w:color w:val="18202B"/>
+                <w:sz w:val="17"/>
+              </w:rPr>
+              <w:t>utility/kafka_factory.py:484 _metadata_checks</w:t>
+            </w:r>
+          </w:p>
+        </w:tc>
+        <w:tc>
+          <w:tcPr>
+            <w:tcW w:type="dxa" w:w="3855"/>
           </w:tcPr>
           <w:p>
             <w:pPr>
@@ -5586,7 +6156,23 @@
                 <w:color w:val="18202B"/>
                 <w:sz w:val="19"/>
               </w:rPr>
-              <w:t>, plus the per-broker failure reasons</w:t>
+              <w:t xml:space="preserve">, when </w:t>
+            </w:r>
+            <w:r>
+              <w:rPr>
+                <w:rFonts w:ascii="Consolas" w:hAnsi="Consolas"/>
+                <w:color w:val="18202B"/>
+                <w:sz w:val="17"/>
+              </w:rPr>
+              <w:t>preflight_metadata_enabled</w:t>
+            </w:r>
+            <w:r>
+              <w:rPr>
+                <w:b w:val="0"/>
+                <w:color w:val="18202B"/>
+                <w:sz w:val="19"/>
+              </w:rPr>
+              <w:t xml:space="preserve"> is on</w:t>
             </w:r>
           </w:p>
         </w:tc>
@@ -5594,7 +6180,7 @@
       <w:tr>
         <w:tc>
           <w:tcPr>
-            <w:tcW w:type="dxa" w:w="1928"/>
+            <w:tcW w:type="dxa" w:w="2041"/>
           </w:tcPr>
           <w:p>
             <w:pPr>
@@ -5607,7 +6193,7 @@
                 <w:color w:val="18202B"/>
                 <w:sz w:val="19"/>
               </w:rPr>
-              <w:t>11 · Classification</w:t>
+              <w:t>14–18 · Batch</w:t>
             </w:r>
           </w:p>
         </w:tc>
@@ -5626,13 +6212,13 @@
                 <w:color w:val="18202B"/>
                 <w:sz w:val="17"/>
               </w:rPr>
-              <w:t>utility/kafka_preflight.py · check_topic_metadata; utility/error_classifier.py</w:t>
+              <w:t>utility/connector_runner.py:398 run_batch</w:t>
             </w:r>
           </w:p>
         </w:tc>
         <w:tc>
           <w:tcPr>
-            <w:tcW w:type="dxa" w:w="3969"/>
+            <w:tcW w:type="dxa" w:w="3855"/>
           </w:tcPr>
           <w:p>
             <w:pPr>
@@ -5645,23 +6231,7 @@
                 <w:color w:val="18202B"/>
                 <w:sz w:val="19"/>
               </w:rPr>
-              <w:t>Maps the error text to a scenario and exit code (</w:t>
-            </w:r>
-            <w:r>
-              <w:rPr>
-                <w:rFonts w:ascii="Consolas" w:hAnsi="Consolas"/>
-                <w:color w:val="18202B"/>
-                <w:sz w:val="17"/>
-              </w:rPr>
-              <w:t>_TRANSPORT</w:t>
-            </w:r>
-            <w:r>
-              <w:rPr>
-                <w:b w:val="0"/>
-                <w:color w:val="18202B"/>
-                <w:sz w:val="19"/>
-              </w:rPr>
-              <w:t xml:space="preserve"> → BROKER_UNAVAILABLE → 32)</w:t>
+              <w:t>Read, build, publish, flush, reconcile</w:t>
             </w:r>
           </w:p>
         </w:tc>
@@ -5669,7 +6239,7 @@
       <w:tr>
         <w:tc>
           <w:tcPr>
-            <w:tcW w:type="dxa" w:w="1928"/>
+            <w:tcW w:type="dxa" w:w="2041"/>
           </w:tcPr>
           <w:p>
             <w:pPr>
@@ -5682,7 +6252,7 @@
                 <w:color w:val="18202B"/>
                 <w:sz w:val="19"/>
               </w:rPr>
-              <w:t>13–17 · Batch</w:t>
+              <w:t>16 · Produce</w:t>
             </w:r>
           </w:p>
         </w:tc>
@@ -5701,13 +6271,13 @@
                 <w:color w:val="18202B"/>
                 <w:sz w:val="17"/>
               </w:rPr>
-              <w:t>utility/connector_runner.py:389 run_batch</w:t>
+              <w:t>utility/kafka_publisher.py:206</w:t>
             </w:r>
           </w:p>
         </w:tc>
         <w:tc>
           <w:tcPr>
-            <w:tcW w:type="dxa" w:w="3969"/>
+            <w:tcW w:type="dxa" w:w="3855"/>
           </w:tcPr>
           <w:p>
             <w:pPr>
@@ -5716,11 +6286,35 @@
             <w:r/>
             <w:r>
               <w:rPr>
+                <w:rFonts w:ascii="Consolas" w:hAnsi="Consolas"/>
+                <w:color w:val="18202B"/>
+                <w:sz w:val="17"/>
+              </w:rPr>
+              <w:t>produce()</w:t>
+            </w:r>
+            <w:r>
+              <w:rPr>
                 <w:b w:val="0"/>
                 <w:color w:val="18202B"/>
                 <w:sz w:val="19"/>
               </w:rPr>
-              <w:t>Read, build, publish, flush, reconcile</w:t>
+              <w:t xml:space="preserve"> then </w:t>
+            </w:r>
+            <w:r>
+              <w:rPr>
+                <w:rFonts w:ascii="Consolas" w:hAnsi="Consolas"/>
+                <w:color w:val="18202B"/>
+                <w:sz w:val="17"/>
+              </w:rPr>
+              <w:t>poll(0)</w:t>
+            </w:r>
+            <w:r>
+              <w:rPr>
+                <w:b w:val="0"/>
+                <w:color w:val="18202B"/>
+                <w:sz w:val="19"/>
+              </w:rPr>
+              <w:t>; librdkafka connects and fetches metadata</w:t>
             </w:r>
           </w:p>
         </w:tc>
@@ -5736,7 +6330,7 @@
           <w:color w:val="5A6575"/>
           <w:sz w:val="17"/>
         </w:rPr>
-        <w:t>Line numbers are from commit e72f4eb on feature/cyberark-envelope: port 9095, 60-second timeouts, per-broker error reasons and the librdkafka trace.</w:t>
+        <w:t>Line numbers are from feature/cyberark-envelope as of 7 October 2026.</w:t>
       </w:r>
     </w:p>
     <w:sectPr>

</xml_diff>